<commit_message>
Use ansible_facts[] for facts and silence interpreter warning
ansible-core 2.21 deprecates top-level fact variables (INJECT_FACTS_AS_VARS),
to be removed in 2.24. Read os_family, default_ipv4, selinux and
all_ipv6_addresses through ansible_facts, including the peer node's
address via hostvars[peer]['ansible_facts']. Set interpreter_python to
auto_silent. SOP v1.1 adds GitHub access setup for the controller
(deploy key or fine-grained token).

Co-Authored-By: Claude Opus 5.5 <noreply@anthropic.com>
Claude-Session: https://claude.ai/code/session_01NAqJ1VuL5bJcoe9iUY18FH
</commit_message>
<xml_diff>
--- a/docs/Infrastructure_Automation_Portal_SOP.docx
+++ b/docs/Infrastructure_Automation_Portal_SOP.docx
@@ -252,7 +252,7 @@
               <w:spacing w:after="0"/>
             </w:pPr>
             <w:r>
-              <w:t xml:space="preserve">1.0</w:t>
+              <w:t xml:space="preserve">1.1</w:t>
             </w:r>
           </w:p>
         </w:tc>
@@ -313,7 +313,7 @@
               <w:spacing w:after="0"/>
             </w:pPr>
             <w:r>
-              <w:t xml:space="preserve">07 October 2026</w:t>
+              <w:t xml:space="preserve">08 October 2026</w:t>
             </w:r>
           </w:p>
         </w:tc>
@@ -987,6 +987,9 @@
             <w:pPr>
               <w:spacing w:after="0"/>
             </w:pPr>
+            <w:r>
+              <w:t xml:space="preserve">1.1</w:t>
+            </w:r>
           </w:p>
         </w:tc>
         <w:tc>
@@ -1010,6 +1013,9 @@
             <w:pPr>
               <w:spacing w:after="0"/>
             </w:pPr>
+            <w:r>
+              <w:t xml:space="preserve">08-Oct-2026</w:t>
+            </w:r>
           </w:p>
         </w:tc>
         <w:tc>
@@ -1033,6 +1039,9 @@
             <w:pPr>
               <w:spacing w:after="0"/>
             </w:pPr>
+            <w:r>
+              <w:t xml:space="preserve">Infrastructure Automation Team</w:t>
+            </w:r>
           </w:p>
         </w:tc>
         <w:tc>
@@ -1045,6 +1054,106 @@
               <w:right w:val="single" w:color="C9D1DA" w:sz="4"/>
             </w:tcBorders>
             <w:shd w:fill="F5F8FB" w:color="auto" w:val="clear"/>
+            <w:tcMar>
+              <w:top w:type="dxa" w:w="60"/>
+              <w:left w:type="dxa" w:w="100"/>
+              <w:bottom w:type="dxa" w:w="60"/>
+              <w:right w:type="dxa" w:w="100"/>
+            </w:tcMar>
+          </w:tcPr>
+          <w:p>
+            <w:pPr>
+              <w:spacing w:after="0"/>
+            </w:pPr>
+            <w:r>
+              <w:t xml:space="preserve">Added 9.1 GitHub access from the controller (SSH deploy key / token)</w:t>
+            </w:r>
+          </w:p>
+        </w:tc>
+      </w:tr>
+      <w:tr>
+        <w:trPr>
+          <w:cantSplit/>
+        </w:trPr>
+        <w:tc>
+          <w:tcPr>
+            <w:tcW w:type="dxa" w:w="1264"/>
+            <w:tcBorders>
+              <w:top w:val="single" w:color="C9D1DA" w:sz="4"/>
+              <w:left w:val="single" w:color="C9D1DA" w:sz="4"/>
+              <w:bottom w:val="single" w:color="C9D1DA" w:sz="4"/>
+              <w:right w:val="single" w:color="C9D1DA" w:sz="4"/>
+            </w:tcBorders>
+            <w:shd w:fill="FFFFFF" w:color="auto" w:val="clear"/>
+            <w:tcMar>
+              <w:top w:type="dxa" w:w="60"/>
+              <w:left w:type="dxa" w:w="100"/>
+              <w:bottom w:type="dxa" w:w="60"/>
+              <w:right w:type="dxa" w:w="100"/>
+            </w:tcMar>
+          </w:tcPr>
+          <w:p>
+            <w:pPr>
+              <w:spacing w:after="0"/>
+            </w:pPr>
+          </w:p>
+        </w:tc>
+        <w:tc>
+          <w:tcPr>
+            <w:tcW w:type="dxa" w:w="1534"/>
+            <w:tcBorders>
+              <w:top w:val="single" w:color="C9D1DA" w:sz="4"/>
+              <w:left w:val="single" w:color="C9D1DA" w:sz="4"/>
+              <w:bottom w:val="single" w:color="C9D1DA" w:sz="4"/>
+              <w:right w:val="single" w:color="C9D1DA" w:sz="4"/>
+            </w:tcBorders>
+            <w:shd w:fill="FFFFFF" w:color="auto" w:val="clear"/>
+            <w:tcMar>
+              <w:top w:type="dxa" w:w="60"/>
+              <w:left w:type="dxa" w:w="100"/>
+              <w:bottom w:type="dxa" w:w="60"/>
+              <w:right w:type="dxa" w:w="100"/>
+            </w:tcMar>
+          </w:tcPr>
+          <w:p>
+            <w:pPr>
+              <w:spacing w:after="0"/>
+            </w:pPr>
+          </w:p>
+        </w:tc>
+        <w:tc>
+          <w:tcPr>
+            <w:tcW w:type="dxa" w:w="2437"/>
+            <w:tcBorders>
+              <w:top w:val="single" w:color="C9D1DA" w:sz="4"/>
+              <w:left w:val="single" w:color="C9D1DA" w:sz="4"/>
+              <w:bottom w:val="single" w:color="C9D1DA" w:sz="4"/>
+              <w:right w:val="single" w:color="C9D1DA" w:sz="4"/>
+            </w:tcBorders>
+            <w:shd w:fill="FFFFFF" w:color="auto" w:val="clear"/>
+            <w:tcMar>
+              <w:top w:type="dxa" w:w="60"/>
+              <w:left w:type="dxa" w:w="100"/>
+              <w:bottom w:type="dxa" w:w="60"/>
+              <w:right w:type="dxa" w:w="100"/>
+            </w:tcMar>
+          </w:tcPr>
+          <w:p>
+            <w:pPr>
+              <w:spacing w:after="0"/>
+            </w:pPr>
+          </w:p>
+        </w:tc>
+        <w:tc>
+          <w:tcPr>
+            <w:tcW w:type="dxa" w:w="3791"/>
+            <w:tcBorders>
+              <w:top w:val="single" w:color="C9D1DA" w:sz="4"/>
+              <w:left w:val="single" w:color="C9D1DA" w:sz="4"/>
+              <w:bottom w:val="single" w:color="C9D1DA" w:sz="4"/>
+              <w:right w:val="single" w:color="C9D1DA" w:sz="4"/>
+            </w:tcBorders>
+            <w:shd w:fill="FFFFFF" w:color="auto" w:val="clear"/>
             <w:tcMar>
               <w:top w:type="dxa" w:w="60"/>
               <w:left w:type="dxa" w:w="100"/>
@@ -1612,37 +1721,37 @@
         </w:p>
         <w:p>
           <w:pPr>
-            <w:pStyle w:val="TOC1"/>
-            <w:tabs>
-              <w:tab w:val="right" w:pos="9026" w:leader="dot"/>
-            </w:tabs>
-          </w:pPr>
-          <w:hyperlink w:history="1" w:anchor="_Toc24">
-            <w:r>
-              <w:t xml:space="preserve">10. SOP-06 – Change the Homepage (look and feel)</w:t>
-            </w:r>
-            <w:r>
-              <w:tab/>
-            </w:r>
-            <w:r>
-              <w:fldChar w:fldCharType="begin" w:dirty="true"/>
-              <w:instrText xml:space="preserve">PAGEREF _Toc24 \h</w:instrText>
-              <w:fldChar w:fldCharType="separate"/>
-              <w:fldChar w:fldCharType="end"/>
-            </w:r>
-          </w:hyperlink>
-        </w:p>
-        <w:p>
-          <w:pPr>
             <w:pStyle w:val="TOC2"/>
             <w:tabs>
               <w:tab w:val="right" w:pos="9026" w:leader="dot"/>
             </w:tabs>
             <w:ind w:left="220"/>
           </w:pPr>
+          <w:hyperlink w:history="1" w:anchor="_Toc24">
+            <w:r>
+              <w:t xml:space="preserve">9.1 GitHub access from the controller (one-time setup)</w:t>
+            </w:r>
+            <w:r>
+              <w:tab/>
+            </w:r>
+            <w:r>
+              <w:fldChar w:fldCharType="begin" w:dirty="true"/>
+              <w:instrText xml:space="preserve">PAGEREF _Toc24 \h</w:instrText>
+              <w:fldChar w:fldCharType="separate"/>
+              <w:fldChar w:fldCharType="end"/>
+            </w:r>
+          </w:hyperlink>
+        </w:p>
+        <w:p>
+          <w:pPr>
+            <w:pStyle w:val="TOC1"/>
+            <w:tabs>
+              <w:tab w:val="right" w:pos="9026" w:leader="dot"/>
+            </w:tabs>
+          </w:pPr>
           <w:hyperlink w:history="1" w:anchor="_Toc25">
             <w:r>
-              <w:t xml:space="preserve">10.1 Change the portal name</w:t>
+              <w:t xml:space="preserve">10. SOP-06 – Change the Homepage (look and feel)</w:t>
             </w:r>
             <w:r>
               <w:tab/>
@@ -1665,7 +1774,7 @@
           </w:pPr>
           <w:hyperlink w:history="1" w:anchor="_Toc26">
             <w:r>
-              <w:t xml:space="preserve">10.2 Replace the logo with your company logo</w:t>
+              <w:t xml:space="preserve">10.1 Change the portal name</w:t>
             </w:r>
             <w:r>
               <w:tab/>
@@ -1688,7 +1797,7 @@
           </w:pPr>
           <w:hyperlink w:history="1" w:anchor="_Toc27">
             <w:r>
-              <w:t xml:space="preserve">10.3 Change colours</w:t>
+              <w:t xml:space="preserve">10.2 Replace the logo with your company logo</w:t>
             </w:r>
             <w:r>
               <w:tab/>
@@ -1711,7 +1820,7 @@
           </w:pPr>
           <w:hyperlink w:history="1" w:anchor="_Toc28">
             <w:r>
-              <w:t xml:space="preserve">10.4 Change a field label, hint, order or required flag</w:t>
+              <w:t xml:space="preserve">10.3 Change colours</w:t>
             </w:r>
             <w:r>
               <w:tab/>
@@ -1734,7 +1843,7 @@
           </w:pPr>
           <w:hyperlink w:history="1" w:anchor="_Toc29">
             <w:r>
-              <w:t xml:space="preserve">10.5 Add a menu item to the sidebar</w:t>
+              <w:t xml:space="preserve">10.4 Change a field label, hint, order or required flag</w:t>
             </w:r>
             <w:r>
               <w:tab/>
@@ -1742,28 +1851,6 @@
             <w:r>
               <w:fldChar w:fldCharType="begin" w:dirty="true"/>
               <w:instrText xml:space="preserve">PAGEREF _Toc29 \h</w:instrText>
-              <w:fldChar w:fldCharType="separate"/>
-              <w:fldChar w:fldCharType="end"/>
-            </w:r>
-          </w:hyperlink>
-        </w:p>
-        <w:p>
-          <w:pPr>
-            <w:pStyle w:val="TOC1"/>
-            <w:tabs>
-              <w:tab w:val="right" w:pos="9026" w:leader="dot"/>
-            </w:tabs>
-          </w:pPr>
-          <w:hyperlink w:history="1" w:anchor="_Toc30">
-            <w:r>
-              <w:t xml:space="preserve">11. SOP-07 – Change Dropdown and Checkbox Values (catalog.yaml)</w:t>
-            </w:r>
-            <w:r>
-              <w:tab/>
-            </w:r>
-            <w:r>
-              <w:fldChar w:fldCharType="begin" w:dirty="true"/>
-              <w:instrText xml:space="preserve">PAGEREF _Toc30 \h</w:instrText>
               <w:fldChar w:fldCharType="separate"/>
               <w:fldChar w:fldCharType="end"/>
             </w:r>
@@ -1777,9 +1864,31 @@
             </w:tabs>
             <w:ind w:left="220"/>
           </w:pPr>
+          <w:hyperlink w:history="1" w:anchor="_Toc30">
+            <w:r>
+              <w:t xml:space="preserve">10.5 Add a menu item to the sidebar</w:t>
+            </w:r>
+            <w:r>
+              <w:tab/>
+            </w:r>
+            <w:r>
+              <w:fldChar w:fldCharType="begin" w:dirty="true"/>
+              <w:instrText xml:space="preserve">PAGEREF _Toc30 \h</w:instrText>
+              <w:fldChar w:fldCharType="separate"/>
+              <w:fldChar w:fldCharType="end"/>
+            </w:r>
+          </w:hyperlink>
+        </w:p>
+        <w:p>
+          <w:pPr>
+            <w:pStyle w:val="TOC1"/>
+            <w:tabs>
+              <w:tab w:val="right" w:pos="9026" w:leader="dot"/>
+            </w:tabs>
+          </w:pPr>
           <w:hyperlink w:history="1" w:anchor="_Toc31">
             <w:r>
-              <w:t xml:space="preserve">11.1 Catalog sections</w:t>
+              <w:t xml:space="preserve">11. SOP-07 – Change Dropdown and Checkbox Values (catalog.yaml)</w:t>
             </w:r>
             <w:r>
               <w:tab/>
@@ -1802,7 +1911,7 @@
           </w:pPr>
           <w:hyperlink w:history="1" w:anchor="_Toc32">
             <w:r>
-              <w:t xml:space="preserve">11.2 Examples</w:t>
+              <w:t xml:space="preserve">11.1 Catalog sections</w:t>
             </w:r>
             <w:r>
               <w:tab/>
@@ -1825,7 +1934,7 @@
           </w:pPr>
           <w:hyperlink w:history="1" w:anchor="_Toc33">
             <w:r>
-              <w:t xml:space="preserve">11.3 Apply the change</w:t>
+              <w:t xml:space="preserve">11.2 Examples</w:t>
             </w:r>
             <w:r>
               <w:tab/>
@@ -1840,14 +1949,15 @@
         </w:p>
         <w:p>
           <w:pPr>
-            <w:pStyle w:val="TOC1"/>
+            <w:pStyle w:val="TOC2"/>
             <w:tabs>
               <w:tab w:val="right" w:pos="9026" w:leader="dot"/>
             </w:tabs>
+            <w:ind w:left="220"/>
           </w:pPr>
           <w:hyperlink w:history="1" w:anchor="_Toc34">
             <w:r>
-              <w:t xml:space="preserve">12. SOP-08 – Add a New Field to the Form</w:t>
+              <w:t xml:space="preserve">11.3 Apply the change</w:t>
             </w:r>
             <w:r>
               <w:tab/>
@@ -1869,7 +1979,7 @@
           </w:pPr>
           <w:hyperlink w:history="1" w:anchor="_Toc35">
             <w:r>
-              <w:t xml:space="preserve">13. SOP-09 – Go Live: Azure DevOps, Sign-in and HTTPS</w:t>
+              <w:t xml:space="preserve">12. SOP-08 – Add a New Field to the Form</w:t>
             </w:r>
             <w:r>
               <w:tab/>
@@ -1884,15 +1994,14 @@
         </w:p>
         <w:p>
           <w:pPr>
-            <w:pStyle w:val="TOC2"/>
+            <w:pStyle w:val="TOC1"/>
             <w:tabs>
               <w:tab w:val="right" w:pos="9026" w:leader="dot"/>
             </w:tabs>
-            <w:ind w:left="220"/>
           </w:pPr>
           <w:hyperlink w:history="1" w:anchor="_Toc36">
             <w:r>
-              <w:t xml:space="preserve">13.1 Part A – Azure DevOps pipeline</w:t>
+              <w:t xml:space="preserve">13. SOP-09 – Go Live: Azure DevOps, Sign-in and HTTPS</w:t>
             </w:r>
             <w:r>
               <w:tab/>
@@ -1915,7 +2024,7 @@
           </w:pPr>
           <w:hyperlink w:history="1" w:anchor="_Toc37">
             <w:r>
-              <w:t xml:space="preserve">13.2 Part B – Microsoft Entra ID sign-in</w:t>
+              <w:t xml:space="preserve">13.1 Part A – Azure DevOps pipeline</w:t>
             </w:r>
             <w:r>
               <w:tab/>
@@ -1938,7 +2047,7 @@
           </w:pPr>
           <w:hyperlink w:history="1" w:anchor="_Toc38">
             <w:r>
-              <w:t xml:space="preserve">13.3 Part C – HTTPS and DNS</w:t>
+              <w:t xml:space="preserve">13.2 Part B – Microsoft Entra ID sign-in</w:t>
             </w:r>
             <w:r>
               <w:tab/>
@@ -1961,7 +2070,7 @@
           </w:pPr>
           <w:hyperlink w:history="1" w:anchor="_Toc39">
             <w:r>
-              <w:t xml:space="preserve">13.4 Part D – Settings and deployment</w:t>
+              <w:t xml:space="preserve">13.3 Part C – HTTPS and DNS</w:t>
             </w:r>
             <w:r>
               <w:tab/>
@@ -1969,28 +2078,6 @@
             <w:r>
               <w:fldChar w:fldCharType="begin" w:dirty="true"/>
               <w:instrText xml:space="preserve">PAGEREF _Toc39 \h</w:instrText>
-              <w:fldChar w:fldCharType="separate"/>
-              <w:fldChar w:fldCharType="end"/>
-            </w:r>
-          </w:hyperlink>
-        </w:p>
-        <w:p>
-          <w:pPr>
-            <w:pStyle w:val="TOC1"/>
-            <w:tabs>
-              <w:tab w:val="right" w:pos="9026" w:leader="dot"/>
-            </w:tabs>
-          </w:pPr>
-          <w:hyperlink w:history="1" w:anchor="_Toc40">
-            <w:r>
-              <w:t xml:space="preserve">14. Rollback Procedure</w:t>
-            </w:r>
-            <w:r>
-              <w:tab/>
-            </w:r>
-            <w:r>
-              <w:fldChar w:fldCharType="begin" w:dirty="true"/>
-              <w:instrText xml:space="preserve">PAGEREF _Toc40 \h</w:instrText>
               <w:fldChar w:fldCharType="separate"/>
               <w:fldChar w:fldCharType="end"/>
             </w:r>
@@ -2004,9 +2091,31 @@
             </w:tabs>
             <w:ind w:left="220"/>
           </w:pPr>
+          <w:hyperlink w:history="1" w:anchor="_Toc40">
+            <w:r>
+              <w:t xml:space="preserve">13.4 Part D – Settings and deployment</w:t>
+            </w:r>
+            <w:r>
+              <w:tab/>
+            </w:r>
+            <w:r>
+              <w:fldChar w:fldCharType="begin" w:dirty="true"/>
+              <w:instrText xml:space="preserve">PAGEREF _Toc40 \h</w:instrText>
+              <w:fldChar w:fldCharType="separate"/>
+              <w:fldChar w:fldCharType="end"/>
+            </w:r>
+          </w:hyperlink>
+        </w:p>
+        <w:p>
+          <w:pPr>
+            <w:pStyle w:val="TOC1"/>
+            <w:tabs>
+              <w:tab w:val="right" w:pos="9026" w:leader="dot"/>
+            </w:tabs>
+          </w:pPr>
           <w:hyperlink w:history="1" w:anchor="_Toc41">
             <w:r>
-              <w:t xml:space="preserve">14.1 Standard rollback (preferred)</w:t>
+              <w:t xml:space="preserve">14. Rollback Procedure</w:t>
             </w:r>
             <w:r>
               <w:tab/>
@@ -2029,7 +2138,7 @@
           </w:pPr>
           <w:hyperlink w:history="1" w:anchor="_Toc42">
             <w:r>
-              <w:t xml:space="preserve">14.2 Emergency rollback (no time to revert)</w:t>
+              <w:t xml:space="preserve">14.1 Standard rollback (preferred)</w:t>
             </w:r>
             <w:r>
               <w:tab/>
@@ -2052,7 +2161,7 @@
           </w:pPr>
           <w:hyperlink w:history="1" w:anchor="_Toc43">
             <w:r>
-              <w:t xml:space="preserve">14.3 Take one node out of service</w:t>
+              <w:t xml:space="preserve">14.2 Emergency rollback (no time to revert)</w:t>
             </w:r>
             <w:r>
               <w:tab/>
@@ -2060,28 +2169,6 @@
             <w:r>
               <w:fldChar w:fldCharType="begin" w:dirty="true"/>
               <w:instrText xml:space="preserve">PAGEREF _Toc43 \h</w:instrText>
-              <w:fldChar w:fldCharType="separate"/>
-              <w:fldChar w:fldCharType="end"/>
-            </w:r>
-          </w:hyperlink>
-        </w:p>
-        <w:p>
-          <w:pPr>
-            <w:pStyle w:val="TOC1"/>
-            <w:tabs>
-              <w:tab w:val="right" w:pos="9026" w:leader="dot"/>
-            </w:tabs>
-          </w:pPr>
-          <w:hyperlink w:history="1" w:anchor="_Toc44">
-            <w:r>
-              <w:t xml:space="preserve">15. SOP-10 – Change the VIP or a Node IP, or Replace a Node</w:t>
-            </w:r>
-            <w:r>
-              <w:tab/>
-            </w:r>
-            <w:r>
-              <w:fldChar w:fldCharType="begin" w:dirty="true"/>
-              <w:instrText xml:space="preserve">PAGEREF _Toc44 \h</w:instrText>
               <w:fldChar w:fldCharType="separate"/>
               <w:fldChar w:fldCharType="end"/>
             </w:r>
@@ -2095,9 +2182,31 @@
             </w:tabs>
             <w:ind w:left="220"/>
           </w:pPr>
+          <w:hyperlink w:history="1" w:anchor="_Toc44">
+            <w:r>
+              <w:t xml:space="preserve">14.3 Take one node out of service</w:t>
+            </w:r>
+            <w:r>
+              <w:tab/>
+            </w:r>
+            <w:r>
+              <w:fldChar w:fldCharType="begin" w:dirty="true"/>
+              <w:instrText xml:space="preserve">PAGEREF _Toc44 \h</w:instrText>
+              <w:fldChar w:fldCharType="separate"/>
+              <w:fldChar w:fldCharType="end"/>
+            </w:r>
+          </w:hyperlink>
+        </w:p>
+        <w:p>
+          <w:pPr>
+            <w:pStyle w:val="TOC1"/>
+            <w:tabs>
+              <w:tab w:val="right" w:pos="9026" w:leader="dot"/>
+            </w:tabs>
+          </w:pPr>
           <w:hyperlink w:history="1" w:anchor="_Toc45">
             <w:r>
-              <w:t xml:space="preserve">15.1 Change the VIP</w:t>
+              <w:t xml:space="preserve">15. SOP-10 – Change the VIP or a Node IP, or Replace a Node</w:t>
             </w:r>
             <w:r>
               <w:tab/>
@@ -2120,7 +2229,7 @@
           </w:pPr>
           <w:hyperlink w:history="1" w:anchor="_Toc46">
             <w:r>
-              <w:t xml:space="preserve">15.2 Change a node IP</w:t>
+              <w:t xml:space="preserve">15.1 Change the VIP</w:t>
             </w:r>
             <w:r>
               <w:tab/>
@@ -2143,7 +2252,7 @@
           </w:pPr>
           <w:hyperlink w:history="1" w:anchor="_Toc47">
             <w:r>
-              <w:t xml:space="preserve">15.3 Replace or rebuild a node</w:t>
+              <w:t xml:space="preserve">15.2 Change a node IP</w:t>
             </w:r>
             <w:r>
               <w:tab/>
@@ -2158,14 +2267,15 @@
         </w:p>
         <w:p>
           <w:pPr>
-            <w:pStyle w:val="TOC1"/>
+            <w:pStyle w:val="TOC2"/>
             <w:tabs>
               <w:tab w:val="right" w:pos="9026" w:leader="dot"/>
             </w:tabs>
+            <w:ind w:left="220"/>
           </w:pPr>
           <w:hyperlink w:history="1" w:anchor="_Toc48">
             <w:r>
-              <w:t xml:space="preserve">16. SOP-11 – Rotate Secrets and Credentials</w:t>
+              <w:t xml:space="preserve">15.3 Replace or rebuild a node</w:t>
             </w:r>
             <w:r>
               <w:tab/>
@@ -2187,7 +2297,7 @@
           </w:pPr>
           <w:hyperlink w:history="1" w:anchor="_Toc49">
             <w:r>
-              <w:t xml:space="preserve">17. Troubleshooting Guide</w:t>
+              <w:t xml:space="preserve">16. SOP-11 – Rotate Secrets and Credentials</w:t>
             </w:r>
             <w:r>
               <w:tab/>
@@ -2202,15 +2312,14 @@
         </w:p>
         <w:p>
           <w:pPr>
-            <w:pStyle w:val="TOC2"/>
+            <w:pStyle w:val="TOC1"/>
             <w:tabs>
               <w:tab w:val="right" w:pos="9026" w:leader="dot"/>
             </w:tabs>
-            <w:ind w:left="220"/>
           </w:pPr>
           <w:hyperlink w:history="1" w:anchor="_Toc50">
             <w:r>
-              <w:t xml:space="preserve">17.1 First steps for any problem</w:t>
+              <w:t xml:space="preserve">17. Troubleshooting Guide</w:t>
             </w:r>
             <w:r>
               <w:tab/>
@@ -2233,7 +2342,7 @@
           </w:pPr>
           <w:hyperlink w:history="1" w:anchor="_Toc51">
             <w:r>
-              <w:t xml:space="preserve">17.2 Symptom → cause → fix</w:t>
+              <w:t xml:space="preserve">17.1 First steps for any problem</w:t>
             </w:r>
             <w:r>
               <w:tab/>
@@ -2256,7 +2365,7 @@
           </w:pPr>
           <w:hyperlink w:history="1" w:anchor="_Toc52">
             <w:r>
-              <w:t xml:space="preserve">17.3 Useful diagnostic commands</w:t>
+              <w:t xml:space="preserve">17.2 Symptom → cause → fix</w:t>
             </w:r>
             <w:r>
               <w:tab/>
@@ -2271,14 +2380,15 @@
         </w:p>
         <w:p>
           <w:pPr>
-            <w:pStyle w:val="TOC1"/>
+            <w:pStyle w:val="TOC2"/>
             <w:tabs>
               <w:tab w:val="right" w:pos="9026" w:leader="dot"/>
             </w:tabs>
+            <w:ind w:left="220"/>
           </w:pPr>
           <w:hyperlink w:history="1" w:anchor="_Toc53">
             <w:r>
-              <w:t xml:space="preserve">18. Command Cheat Sheet</w:t>
+              <w:t xml:space="preserve">17.3 Useful diagnostic commands</w:t>
             </w:r>
             <w:r>
               <w:tab/>
@@ -2300,7 +2410,7 @@
           </w:pPr>
           <w:hyperlink w:history="1" w:anchor="_Toc54">
             <w:r>
-              <w:t xml:space="preserve">Appendix A – Configuration Variables (group_vars/frontend.yml)</w:t>
+              <w:t xml:space="preserve">18. Command Cheat Sheet</w:t>
             </w:r>
             <w:r>
               <w:tab/>
@@ -2322,7 +2432,7 @@
           </w:pPr>
           <w:hyperlink w:history="1" w:anchor="_Toc55">
             <w:r>
-              <w:t xml:space="preserve">Appendix B – Pipeline Parameters and Request Data</w:t>
+              <w:t xml:space="preserve">Appendix A – Configuration Variables (group_vars/frontend.yml)</w:t>
             </w:r>
             <w:r>
               <w:tab/>
@@ -2337,15 +2447,14 @@
         </w:p>
         <w:p>
           <w:pPr>
-            <w:pStyle w:val="TOC2"/>
+            <w:pStyle w:val="TOC1"/>
             <w:tabs>
               <w:tab w:val="right" w:pos="9026" w:leader="dot"/>
             </w:tabs>
-            <w:ind w:left="220"/>
           </w:pPr>
           <w:hyperlink w:history="1" w:anchor="_Toc56">
             <w:r>
-              <w:t xml:space="preserve">B.1 Parameters sent by the portal</w:t>
+              <w:t xml:space="preserve">Appendix B – Pipeline Parameters and Request Data</w:t>
             </w:r>
             <w:r>
               <w:tab/>
@@ -2368,7 +2477,7 @@
           </w:pPr>
           <w:hyperlink w:history="1" w:anchor="_Toc57">
             <w:r>
-              <w:t xml:space="preserve">B.2 Keys inside requestJson</w:t>
+              <w:t xml:space="preserve">B.1 Parameters sent by the portal</w:t>
             </w:r>
             <w:r>
               <w:tab/>
@@ -2376,6 +2485,29 @@
             <w:r>
               <w:fldChar w:fldCharType="begin" w:dirty="true"/>
               <w:instrText xml:space="preserve">PAGEREF _Toc57 \h</w:instrText>
+              <w:fldChar w:fldCharType="separate"/>
+              <w:fldChar w:fldCharType="end"/>
+            </w:r>
+          </w:hyperlink>
+        </w:p>
+        <w:p>
+          <w:pPr>
+            <w:pStyle w:val="TOC2"/>
+            <w:tabs>
+              <w:tab w:val="right" w:pos="9026" w:leader="dot"/>
+            </w:tabs>
+            <w:ind w:left="220"/>
+          </w:pPr>
+          <w:hyperlink w:history="1" w:anchor="_Toc58">
+            <w:r>
+              <w:t xml:space="preserve">B.2 Keys inside requestJson</w:t>
+            </w:r>
+            <w:r>
+              <w:tab/>
+            </w:r>
+            <w:r>
+              <w:fldChar w:fldCharType="begin" w:dirty="true"/>
+              <w:instrText xml:space="preserve">PAGEREF _Toc58 \h</w:instrText>
               <w:fldChar w:fldCharType="separate"/>
               <w:fldChar w:fldCharType="end"/>
             </w:r>
@@ -2388,7 +2520,7 @@
               <w:tab w:val="right" w:pos="9026" w:leader="dot"/>
             </w:tabs>
           </w:pPr>
-          <w:hyperlink w:history="1" w:anchor="_Toc58">
+          <w:hyperlink w:history="1" w:anchor="_Toc59">
             <w:r>
               <w:t xml:space="preserve">Appendix C – Screenshots</w:t>
             </w:r>
@@ -2397,7 +2529,7 @@
             </w:r>
             <w:r>
               <w:fldChar w:fldCharType="begin" w:dirty="true"/>
-              <w:instrText xml:space="preserve">PAGEREF _Toc58 \h</w:instrText>
+              <w:instrText xml:space="preserve">PAGEREF _Toc59 \h</w:instrText>
               <w:fldChar w:fldCharType="separate"/>
               <w:fldChar w:fldCharType="end"/>
             </w:r>
@@ -10962,14 +11094,498 @@
     </w:p>
     <w:p>
       <w:pPr>
+        <w:pStyle w:val="Heading2"/>
+      </w:pPr>
+      <w:bookmarkStart w:name="_Toc24" w:id="24"/>
+      <w:r>
+        <w:t xml:space="preserve">9.1 GitHub access from the controller (one-time setup)</w:t>
+      </w:r>
+      <w:bookmarkEnd w:id="24"/>
+    </w:p>
+    <w:p>
+      <w:pPr>
+        <w:spacing w:after="120"/>
+      </w:pPr>
+      <w:r>
+        <w:t xml:space="preserve">GitHub does not accept account passwords for git. A push with a password fails with "Password authentication is not supported for Git operations". Set up one of the two options below once on the controller.</w:t>
+      </w:r>
+    </w:p>
+    <w:p>
+      <w:pPr>
+        <w:pStyle w:val="Heading3"/>
+      </w:pPr>
+      <w:r>
+        <w:t xml:space="preserve">Option A (recommended) – SSH deploy key for this repository</w:t>
+      </w:r>
+    </w:p>
+    <w:p>
+      <w:pPr>
+        <w:pStyle w:val="ListParagraph"/>
+        <w:numPr>
+          <w:ilvl w:val="0"/>
+          <w:numId w:val="8"/>
+        </w:numPr>
+        <w:spacing w:after="80"/>
+      </w:pPr>
+      <w:r>
+        <w:t xml:space="preserve">Create a key on the controller and show the public part:</w:t>
+      </w:r>
+    </w:p>
+    <w:p>
+      <w:pPr>
+        <w:pBdr>
+          <w:left w:val="single" w:color="2F6FA5" w:sz="18" w:space="6"/>
+        </w:pBdr>
+        <w:shd w:fill="F2F4F7" w:color="auto" w:val="clear"/>
+        <w:spacing w:after="0" w:before="60" w:line="240" w:lineRule="auto"/>
+        <w:ind w:left="140" w:right="140"/>
+      </w:pPr>
+      <w:r>
+        <w:rPr>
+          <w:rFonts w:ascii="Consolas" w:cs="Consolas" w:eastAsia="Consolas" w:hAnsi="Consolas"/>
+          <w:color w:val="1E2A36"/>
+          <w:sz w:val="17"/>
+          <w:szCs w:val="17"/>
+        </w:rPr>
+        <w:t xml:space="preserve">ssh-keygen -t ed25519 -C "uxus1sitaans011 deploy" -f ~/.ssh/github_azure_arc -N ""</w:t>
+      </w:r>
+    </w:p>
+    <w:p>
+      <w:pPr>
+        <w:pBdr>
+          <w:left w:val="single" w:color="2F6FA5" w:sz="18" w:space="6"/>
+        </w:pBdr>
+        <w:shd w:fill="F2F4F7" w:color="auto" w:val="clear"/>
+        <w:spacing w:after="140" w:before="0" w:line="240" w:lineRule="auto"/>
+        <w:ind w:left="140" w:right="140"/>
+      </w:pPr>
+      <w:r>
+        <w:rPr>
+          <w:rFonts w:ascii="Consolas" w:cs="Consolas" w:eastAsia="Consolas" w:hAnsi="Consolas"/>
+          <w:color w:val="1E2A36"/>
+          <w:sz w:val="17"/>
+          <w:szCs w:val="17"/>
+        </w:rPr>
+        <w:t xml:space="preserve">cat ~/.ssh/github_azure_arc.pub</w:t>
+      </w:r>
+    </w:p>
+    <w:p>
+      <w:pPr>
+        <w:pStyle w:val="ListParagraph"/>
+        <w:numPr>
+          <w:ilvl w:val="0"/>
+          <w:numId w:val="8"/>
+        </w:numPr>
+        <w:spacing w:after="80"/>
+      </w:pPr>
+      <w:r>
+        <w:t xml:space="preserve">In GitHub: repository </w:t>
+      </w:r>
+      <w:r>
+        <w:rPr>
+          <w:b/>
+          <w:bCs/>
+        </w:rPr>
+        <w:t xml:space="preserve">Settings → Deploy keys → Add deploy key</w:t>
+      </w:r>
+      <w:r>
+        <w:t xml:space="preserve">. Paste the public key, tick </w:t>
+      </w:r>
+      <w:r>
+        <w:rPr>
+          <w:b/>
+          <w:bCs/>
+        </w:rPr>
+        <w:t xml:space="preserve">Allow write access</w:t>
+      </w:r>
+      <w:r>
+        <w:t xml:space="preserve">, save.</w:t>
+      </w:r>
+    </w:p>
+    <w:p>
+      <w:pPr>
+        <w:pStyle w:val="ListParagraph"/>
+        <w:numPr>
+          <w:ilvl w:val="0"/>
+          <w:numId w:val="8"/>
+        </w:numPr>
+        <w:spacing w:after="80"/>
+      </w:pPr>
+      <w:r>
+        <w:t xml:space="preserve">Tell SSH to use this key for GitHub, and switch the repository to SSH:</w:t>
+      </w:r>
+    </w:p>
+    <w:p>
+      <w:pPr>
+        <w:pBdr>
+          <w:left w:val="single" w:color="2F6FA5" w:sz="18" w:space="6"/>
+        </w:pBdr>
+        <w:shd w:fill="F2F4F7" w:color="auto" w:val="clear"/>
+        <w:spacing w:after="0" w:before="60" w:line="240" w:lineRule="auto"/>
+        <w:ind w:left="140" w:right="140"/>
+      </w:pPr>
+      <w:r>
+        <w:rPr>
+          <w:rFonts w:ascii="Consolas" w:cs="Consolas" w:eastAsia="Consolas" w:hAnsi="Consolas"/>
+          <w:color w:val="1E2A36"/>
+          <w:sz w:val="17"/>
+          <w:szCs w:val="17"/>
+        </w:rPr>
+        <w:t xml:space="preserve">cat &gt;&gt; ~/.ssh/config &lt;&lt;'EOF'</w:t>
+      </w:r>
+    </w:p>
+    <w:p>
+      <w:pPr>
+        <w:pBdr>
+          <w:left w:val="single" w:color="2F6FA5" w:sz="18" w:space="6"/>
+        </w:pBdr>
+        <w:shd w:fill="F2F4F7" w:color="auto" w:val="clear"/>
+        <w:spacing w:after="0" w:before="0" w:line="240" w:lineRule="auto"/>
+        <w:ind w:left="140" w:right="140"/>
+      </w:pPr>
+      <w:r>
+        <w:rPr>
+          <w:rFonts w:ascii="Consolas" w:cs="Consolas" w:eastAsia="Consolas" w:hAnsi="Consolas"/>
+          <w:color w:val="1E2A36"/>
+          <w:sz w:val="17"/>
+          <w:szCs w:val="17"/>
+        </w:rPr>
+        <w:t xml:space="preserve">Host github.com</w:t>
+      </w:r>
+    </w:p>
+    <w:p>
+      <w:pPr>
+        <w:pBdr>
+          <w:left w:val="single" w:color="2F6FA5" w:sz="18" w:space="6"/>
+        </w:pBdr>
+        <w:shd w:fill="F2F4F7" w:color="auto" w:val="clear"/>
+        <w:spacing w:after="0" w:before="0" w:line="240" w:lineRule="auto"/>
+        <w:ind w:left="140" w:right="140"/>
+      </w:pPr>
+      <w:r>
+        <w:rPr>
+          <w:rFonts w:ascii="Consolas" w:cs="Consolas" w:eastAsia="Consolas" w:hAnsi="Consolas"/>
+          <w:color w:val="1E2A36"/>
+          <w:sz w:val="17"/>
+          <w:szCs w:val="17"/>
+        </w:rPr>
+        <w:t xml:space="preserve">  IdentityFile ~/.ssh/github_azure_arc</w:t>
+      </w:r>
+    </w:p>
+    <w:p>
+      <w:pPr>
+        <w:pBdr>
+          <w:left w:val="single" w:color="2F6FA5" w:sz="18" w:space="6"/>
+        </w:pBdr>
+        <w:shd w:fill="F2F4F7" w:color="auto" w:val="clear"/>
+        <w:spacing w:after="0" w:before="0" w:line="240" w:lineRule="auto"/>
+        <w:ind w:left="140" w:right="140"/>
+      </w:pPr>
+      <w:r>
+        <w:rPr>
+          <w:rFonts w:ascii="Consolas" w:cs="Consolas" w:eastAsia="Consolas" w:hAnsi="Consolas"/>
+          <w:color w:val="1E2A36"/>
+          <w:sz w:val="17"/>
+          <w:szCs w:val="17"/>
+        </w:rPr>
+        <w:t xml:space="preserve">  IdentitiesOnly yes</w:t>
+      </w:r>
+    </w:p>
+    <w:p>
+      <w:pPr>
+        <w:pBdr>
+          <w:left w:val="single" w:color="2F6FA5" w:sz="18" w:space="6"/>
+        </w:pBdr>
+        <w:shd w:fill="F2F4F7" w:color="auto" w:val="clear"/>
+        <w:spacing w:after="0" w:before="0" w:line="240" w:lineRule="auto"/>
+        <w:ind w:left="140" w:right="140"/>
+      </w:pPr>
+      <w:r>
+        <w:rPr>
+          <w:rFonts w:ascii="Consolas" w:cs="Consolas" w:eastAsia="Consolas" w:hAnsi="Consolas"/>
+          <w:color w:val="1E2A36"/>
+          <w:sz w:val="17"/>
+          <w:szCs w:val="17"/>
+        </w:rPr>
+        <w:t xml:space="preserve">EOF</w:t>
+      </w:r>
+    </w:p>
+    <w:p>
+      <w:pPr>
+        <w:pBdr>
+          <w:left w:val="single" w:color="2F6FA5" w:sz="18" w:space="6"/>
+        </w:pBdr>
+        <w:shd w:fill="F2F4F7" w:color="auto" w:val="clear"/>
+        <w:spacing w:after="0" w:before="0" w:line="240" w:lineRule="auto"/>
+        <w:ind w:left="140" w:right="140"/>
+      </w:pPr>
+      <w:r>
+        <w:rPr>
+          <w:rFonts w:ascii="Consolas" w:cs="Consolas" w:eastAsia="Consolas" w:hAnsi="Consolas"/>
+          <w:color w:val="1E2A36"/>
+          <w:sz w:val="17"/>
+          <w:szCs w:val="17"/>
+        </w:rPr>
+        <w:t xml:space="preserve">chmod 600 ~/.ssh/config</w:t>
+      </w:r>
+    </w:p>
+    <w:p>
+      <w:pPr>
+        <w:pBdr>
+          <w:left w:val="single" w:color="2F6FA5" w:sz="18" w:space="6"/>
+        </w:pBdr>
+        <w:shd w:fill="F2F4F7" w:color="auto" w:val="clear"/>
+        <w:spacing w:after="0" w:before="0" w:line="240" w:lineRule="auto"/>
+        <w:ind w:left="140" w:right="140"/>
+      </w:pPr>
+      <w:r>
+        <w:rPr>
+          <w:rFonts w:ascii="Consolas" w:cs="Consolas" w:eastAsia="Consolas" w:hAnsi="Consolas"/>
+          <w:color w:val="1E2A36"/>
+          <w:sz w:val="17"/>
+          <w:szCs w:val="17"/>
+        </w:rPr>
+        <w:t xml:space="preserve">cd /data/ansible/Azure_Arc_frontend</w:t>
+      </w:r>
+    </w:p>
+    <w:p>
+      <w:pPr>
+        <w:pBdr>
+          <w:left w:val="single" w:color="2F6FA5" w:sz="18" w:space="6"/>
+        </w:pBdr>
+        <w:shd w:fill="F2F4F7" w:color="auto" w:val="clear"/>
+        <w:spacing w:after="0" w:before="0" w:line="240" w:lineRule="auto"/>
+        <w:ind w:left="140" w:right="140"/>
+      </w:pPr>
+      <w:r>
+        <w:rPr>
+          <w:rFonts w:ascii="Consolas" w:cs="Consolas" w:eastAsia="Consolas" w:hAnsi="Consolas"/>
+          <w:color w:val="1E2A36"/>
+          <w:sz w:val="17"/>
+          <w:szCs w:val="17"/>
+        </w:rPr>
+        <w:t xml:space="preserve">git remote set-url origin git@github.com:nahmad23/Azure_Arc_frontend.git</w:t>
+      </w:r>
+    </w:p>
+    <w:p>
+      <w:pPr>
+        <w:pBdr>
+          <w:left w:val="single" w:color="2F6FA5" w:sz="18" w:space="6"/>
+        </w:pBdr>
+        <w:shd w:fill="F2F4F7" w:color="auto" w:val="clear"/>
+        <w:spacing w:after="0" w:before="0" w:line="240" w:lineRule="auto"/>
+        <w:ind w:left="140" w:right="140"/>
+      </w:pPr>
+      <w:r>
+        <w:rPr>
+          <w:rFonts w:ascii="Consolas" w:cs="Consolas" w:eastAsia="Consolas" w:hAnsi="Consolas"/>
+          <w:color w:val="1E2A36"/>
+          <w:sz w:val="17"/>
+          <w:szCs w:val="17"/>
+        </w:rPr>
+        <w:t xml:space="preserve">ssh -T git@github.com            # answer "yes" once; expect "successfully authenticated"</w:t>
+      </w:r>
+    </w:p>
+    <w:p>
+      <w:pPr>
+        <w:pBdr>
+          <w:left w:val="single" w:color="2F6FA5" w:sz="18" w:space="6"/>
+        </w:pBdr>
+        <w:shd w:fill="F2F4F7" w:color="auto" w:val="clear"/>
+        <w:spacing w:after="140" w:before="0" w:line="240" w:lineRule="auto"/>
+        <w:ind w:left="140" w:right="140"/>
+      </w:pPr>
+      <w:r>
+        <w:rPr>
+          <w:rFonts w:ascii="Consolas" w:cs="Consolas" w:eastAsia="Consolas" w:hAnsi="Consolas"/>
+          <w:color w:val="1E2A36"/>
+          <w:sz w:val="17"/>
+          <w:szCs w:val="17"/>
+        </w:rPr>
+        <w:t xml:space="preserve">git push origin claude/stoic-maxwell-p3ubfj</w:t>
+      </w:r>
+    </w:p>
+    <w:p>
+      <w:pPr>
+        <w:spacing w:after="120"/>
+      </w:pPr>
+      <w:r>
+        <w:t xml:space="preserve">If the controller cannot reach GitHub on port 22, use Option B.</w:t>
+      </w:r>
+    </w:p>
+    <w:p>
+      <w:pPr>
+        <w:pStyle w:val="Heading3"/>
+      </w:pPr>
+      <w:r>
+        <w:t xml:space="preserve">Option B – personal access token over HTTPS</w:t>
+      </w:r>
+    </w:p>
+    <w:p>
+      <w:pPr>
+        <w:pStyle w:val="ListParagraph"/>
+        <w:numPr>
+          <w:ilvl w:val="0"/>
+          <w:numId w:val="9"/>
+        </w:numPr>
+        <w:spacing w:after="80"/>
+      </w:pPr>
+      <w:r>
+        <w:t xml:space="preserve">In GitHub: profile </w:t>
+      </w:r>
+      <w:r>
+        <w:rPr>
+          <w:b/>
+          <w:bCs/>
+        </w:rPr>
+        <w:t xml:space="preserve">Settings → Developer settings → Personal access tokens → Fine-grained tokens → Generate new token</w:t>
+      </w:r>
+      <w:r>
+        <w:t xml:space="preserve">. Repository access: only Azure_Arc_frontend. Permissions: </w:t>
+      </w:r>
+      <w:r>
+        <w:rPr>
+          <w:b/>
+          <w:bCs/>
+        </w:rPr>
+        <w:t xml:space="preserve">Contents: Read and write</w:t>
+      </w:r>
+      <w:r>
+        <w:t xml:space="preserve">. Set an expiry date and copy the token.</w:t>
+      </w:r>
+    </w:p>
+    <w:p>
+      <w:pPr>
+        <w:pStyle w:val="ListParagraph"/>
+        <w:numPr>
+          <w:ilvl w:val="0"/>
+          <w:numId w:val="9"/>
+        </w:numPr>
+        <w:spacing w:after="80"/>
+      </w:pPr>
+      <w:r>
+        <w:t xml:space="preserve">Push, and enter the token when git asks for the password:</w:t>
+      </w:r>
+    </w:p>
+    <w:p>
+      <w:pPr>
+        <w:pBdr>
+          <w:left w:val="single" w:color="2F6FA5" w:sz="18" w:space="6"/>
+        </w:pBdr>
+        <w:shd w:fill="F2F4F7" w:color="auto" w:val="clear"/>
+        <w:spacing w:after="0" w:before="60" w:line="240" w:lineRule="auto"/>
+        <w:ind w:left="140" w:right="140"/>
+      </w:pPr>
+      <w:r>
+        <w:rPr>
+          <w:rFonts w:ascii="Consolas" w:cs="Consolas" w:eastAsia="Consolas" w:hAnsi="Consolas"/>
+          <w:color w:val="1E2A36"/>
+          <w:sz w:val="17"/>
+          <w:szCs w:val="17"/>
+        </w:rPr>
+        <w:t xml:space="preserve">git config --global credential.helper store      # remembers the token in ~/.git-credentials (mode 600)</w:t>
+      </w:r>
+    </w:p>
+    <w:p>
+      <w:pPr>
+        <w:pBdr>
+          <w:left w:val="single" w:color="2F6FA5" w:sz="18" w:space="6"/>
+        </w:pBdr>
+        <w:shd w:fill="F2F4F7" w:color="auto" w:val="clear"/>
+        <w:spacing w:after="0" w:before="0" w:line="240" w:lineRule="auto"/>
+        <w:ind w:left="140" w:right="140"/>
+      </w:pPr>
+      <w:r>
+        <w:rPr>
+          <w:rFonts w:ascii="Consolas" w:cs="Consolas" w:eastAsia="Consolas" w:hAnsi="Consolas"/>
+          <w:color w:val="1E2A36"/>
+          <w:sz w:val="17"/>
+          <w:szCs w:val="17"/>
+        </w:rPr>
+        <w:t xml:space="preserve">git push origin claude/stoic-maxwell-p3ubfj</w:t>
+      </w:r>
+    </w:p>
+    <w:p>
+      <w:pPr>
+        <w:pBdr>
+          <w:left w:val="single" w:color="2F6FA5" w:sz="18" w:space="6"/>
+        </w:pBdr>
+        <w:shd w:fill="F2F4F7" w:color="auto" w:val="clear"/>
+        <w:spacing w:after="0" w:before="0" w:line="240" w:lineRule="auto"/>
+        <w:ind w:left="140" w:right="140"/>
+      </w:pPr>
+      <w:r>
+        <w:rPr>
+          <w:rFonts w:ascii="Consolas" w:cs="Consolas" w:eastAsia="Consolas" w:hAnsi="Consolas"/>
+          <w:color w:val="1E2A36"/>
+          <w:sz w:val="17"/>
+          <w:szCs w:val="17"/>
+        </w:rPr>
+        <w:t xml:space="preserve"># Username: nahmad23</w:t>
+      </w:r>
+    </w:p>
+    <w:p>
+      <w:pPr>
+        <w:pBdr>
+          <w:left w:val="single" w:color="2F6FA5" w:sz="18" w:space="6"/>
+        </w:pBdr>
+        <w:shd w:fill="F2F4F7" w:color="auto" w:val="clear"/>
+        <w:spacing w:after="140" w:before="0" w:line="240" w:lineRule="auto"/>
+        <w:ind w:left="140" w:right="140"/>
+      </w:pPr>
+      <w:r>
+        <w:rPr>
+          <w:rFonts w:ascii="Consolas" w:cs="Consolas" w:eastAsia="Consolas" w:hAnsi="Consolas"/>
+          <w:color w:val="1E2A36"/>
+          <w:sz w:val="17"/>
+          <w:szCs w:val="17"/>
+        </w:rPr>
+        <w:t xml:space="preserve"># Password: &lt;paste the token, not your GitHub password&gt;</w:t>
+      </w:r>
+    </w:p>
+    <w:p>
+      <w:pPr>
+        <w:pBdr>
+          <w:left w:val="single" w:color="2F6FA5" w:sz="24" w:space="8"/>
+        </w:pBdr>
+        <w:shd w:fill="EAF2FA" w:color="auto" w:val="clear"/>
+        <w:spacing w:after="160" w:before="80"/>
+        <w:ind w:left="140" w:right="140"/>
+      </w:pPr>
+      <w:r>
+        <w:rPr>
+          <w:b/>
+          <w:bCs/>
+          <w:color w:val="2F6FA5"/>
+        </w:rPr>
+        <w:t xml:space="preserve">Note: </w:t>
+      </w:r>
+      <w:r>
+        <w:t xml:space="preserve">If a push is rejected because GitHub has newer commits, run </w:t>
+      </w:r>
+      <w:r>
+        <w:rPr>
+          <w:rFonts w:ascii="Consolas" w:cs="Consolas" w:eastAsia="Consolas" w:hAnsi="Consolas"/>
+          <w:color w:val="8A2F2A"/>
+          <w:sz w:val="19"/>
+          <w:szCs w:val="19"/>
+        </w:rPr>
+        <w:t xml:space="preserve">git pull origin claude/stoic-maxwell-p3ubfj</w:t>
+      </w:r>
+      <w:r>
+        <w:t xml:space="preserve"> first (it merges them), then push again.</w:t>
+      </w:r>
+    </w:p>
+    <w:p>
+      <w:pPr>
         <w:pStyle w:val="Heading1"/>
         <w:pageBreakBefore/>
       </w:pPr>
-      <w:bookmarkStart w:name="_Toc24" w:id="24"/>
+      <w:bookmarkStart w:name="_Toc25" w:id="25"/>
       <w:r>
         <w:t xml:space="preserve">10. SOP-06 – Change the Homepage (look and feel)</w:t>
       </w:r>
-      <w:bookmarkEnd w:id="24"/>
+      <w:bookmarkEnd w:id="25"/>
     </w:p>
     <w:p>
       <w:pPr>
@@ -12108,18 +12724,18 @@
       <w:pPr>
         <w:pStyle w:val="Heading2"/>
       </w:pPr>
-      <w:bookmarkStart w:name="_Toc25" w:id="25"/>
+      <w:bookmarkStart w:name="_Toc26" w:id="26"/>
       <w:r>
         <w:t xml:space="preserve">10.1 Change the portal name</w:t>
       </w:r>
-      <w:bookmarkEnd w:id="25"/>
+      <w:bookmarkEnd w:id="26"/>
     </w:p>
     <w:p>
       <w:pPr>
         <w:pStyle w:val="ListParagraph"/>
         <w:numPr>
           <w:ilvl w:val="0"/>
-          <w:numId w:val="8"/>
+          <w:numId w:val="10"/>
         </w:numPr>
         <w:spacing w:after="80"/>
       </w:pPr>
@@ -12162,18 +12778,18 @@
       <w:pPr>
         <w:pStyle w:val="Heading2"/>
       </w:pPr>
-      <w:bookmarkStart w:name="_Toc26" w:id="26"/>
+      <w:bookmarkStart w:name="_Toc27" w:id="27"/>
       <w:r>
         <w:t xml:space="preserve">10.2 Replace the logo with your company logo</w:t>
       </w:r>
-      <w:bookmarkEnd w:id="26"/>
+      <w:bookmarkEnd w:id="27"/>
     </w:p>
     <w:p>
       <w:pPr>
         <w:pStyle w:val="ListParagraph"/>
         <w:numPr>
           <w:ilvl w:val="0"/>
-          <w:numId w:val="9"/>
+          <w:numId w:val="11"/>
         </w:numPr>
         <w:spacing w:after="80"/>
       </w:pPr>
@@ -12198,7 +12814,7 @@
         <w:pStyle w:val="ListParagraph"/>
         <w:numPr>
           <w:ilvl w:val="0"/>
-          <w:numId w:val="9"/>
+          <w:numId w:val="11"/>
         </w:numPr>
         <w:spacing w:after="80"/>
       </w:pPr>
@@ -12254,7 +12870,7 @@
         <w:pStyle w:val="ListParagraph"/>
         <w:numPr>
           <w:ilvl w:val="0"/>
-          <w:numId w:val="9"/>
+          <w:numId w:val="11"/>
         </w:numPr>
         <w:spacing w:after="80"/>
       </w:pPr>
@@ -12297,11 +12913,11 @@
       <w:pPr>
         <w:pStyle w:val="Heading2"/>
       </w:pPr>
-      <w:bookmarkStart w:name="_Toc27" w:id="27"/>
+      <w:bookmarkStart w:name="_Toc28" w:id="28"/>
       <w:r>
         <w:t xml:space="preserve">10.3 Change colours</w:t>
       </w:r>
-      <w:bookmarkEnd w:id="27"/>
+      <w:bookmarkEnd w:id="28"/>
     </w:p>
     <w:p>
       <w:pPr>
@@ -13025,11 +13641,11 @@
       <w:pPr>
         <w:pStyle w:val="Heading2"/>
       </w:pPr>
-      <w:bookmarkStart w:name="_Toc28" w:id="28"/>
+      <w:bookmarkStart w:name="_Toc29" w:id="29"/>
       <w:r>
         <w:t xml:space="preserve">10.4 Change a field label, hint, order or required flag</w:t>
       </w:r>
-      <w:bookmarkEnd w:id="28"/>
+      <w:bookmarkEnd w:id="29"/>
     </w:p>
     <w:p>
       <w:pPr>
@@ -13185,11 +13801,11 @@
       <w:pPr>
         <w:pStyle w:val="Heading2"/>
       </w:pPr>
-      <w:bookmarkStart w:name="_Toc29" w:id="29"/>
+      <w:bookmarkStart w:name="_Toc30" w:id="30"/>
       <w:r>
         <w:t xml:space="preserve">10.5 Add a menu item to the sidebar</w:t>
       </w:r>
-      <w:bookmarkEnd w:id="29"/>
+      <w:bookmarkEnd w:id="30"/>
     </w:p>
     <w:p>
       <w:pPr>
@@ -13254,11 +13870,11 @@
         <w:pStyle w:val="Heading1"/>
         <w:pageBreakBefore/>
       </w:pPr>
-      <w:bookmarkStart w:name="_Toc30" w:id="30"/>
+      <w:bookmarkStart w:name="_Toc31" w:id="31"/>
       <w:r>
         <w:t xml:space="preserve">11. SOP-07 – Change Dropdown and Checkbox Values (catalog.yaml)</w:t>
       </w:r>
-      <w:bookmarkEnd w:id="30"/>
+      <w:bookmarkEnd w:id="31"/>
     </w:p>
     <w:p>
       <w:pPr>
@@ -13341,11 +13957,11 @@
       <w:pPr>
         <w:pStyle w:val="Heading2"/>
       </w:pPr>
-      <w:bookmarkStart w:name="_Toc31" w:id="31"/>
+      <w:bookmarkStart w:name="_Toc32" w:id="32"/>
       <w:r>
         <w:t xml:space="preserve">11.1 Catalog sections</w:t>
       </w:r>
-      <w:bookmarkEnd w:id="31"/>
+      <w:bookmarkEnd w:id="32"/>
     </w:p>
     <w:tbl>
       <w:tblPr>
@@ -14177,11 +14793,11 @@
       <w:pPr>
         <w:pStyle w:val="Heading2"/>
       </w:pPr>
-      <w:bookmarkStart w:name="_Toc32" w:id="32"/>
+      <w:bookmarkStart w:name="_Toc33" w:id="33"/>
       <w:r>
         <w:t xml:space="preserve">11.2 Examples</w:t>
       </w:r>
-      <w:bookmarkEnd w:id="32"/>
+      <w:bookmarkEnd w:id="33"/>
     </w:p>
     <w:p>
       <w:pPr>
@@ -14743,18 +15359,18 @@
       <w:pPr>
         <w:pStyle w:val="Heading2"/>
       </w:pPr>
-      <w:bookmarkStart w:name="_Toc33" w:id="33"/>
+      <w:bookmarkStart w:name="_Toc34" w:id="34"/>
       <w:r>
         <w:t xml:space="preserve">11.3 Apply the change</w:t>
       </w:r>
-      <w:bookmarkEnd w:id="33"/>
+      <w:bookmarkEnd w:id="34"/>
     </w:p>
     <w:p>
       <w:pPr>
         <w:pStyle w:val="ListParagraph"/>
         <w:numPr>
           <w:ilvl w:val="0"/>
-          <w:numId w:val="10"/>
+          <w:numId w:val="12"/>
         </w:numPr>
         <w:spacing w:after="80"/>
       </w:pPr>
@@ -14779,7 +15395,7 @@
         <w:pStyle w:val="ListParagraph"/>
         <w:numPr>
           <w:ilvl w:val="0"/>
-          <w:numId w:val="10"/>
+          <w:numId w:val="12"/>
         </w:numPr>
         <w:spacing w:after="80"/>
       </w:pPr>
@@ -14816,7 +15432,7 @@
         <w:pStyle w:val="ListParagraph"/>
         <w:numPr>
           <w:ilvl w:val="0"/>
-          <w:numId w:val="10"/>
+          <w:numId w:val="12"/>
         </w:numPr>
         <w:spacing w:after="80"/>
       </w:pPr>
@@ -14841,7 +15457,7 @@
         <w:pStyle w:val="ListParagraph"/>
         <w:numPr>
           <w:ilvl w:val="0"/>
-          <w:numId w:val="10"/>
+          <w:numId w:val="12"/>
         </w:numPr>
         <w:spacing w:after="80"/>
       </w:pPr>
@@ -14854,11 +15470,11 @@
         <w:pStyle w:val="Heading1"/>
         <w:pageBreakBefore/>
       </w:pPr>
-      <w:bookmarkStart w:name="_Toc34" w:id="34"/>
+      <w:bookmarkStart w:name="_Toc35" w:id="35"/>
       <w:r>
         <w:t xml:space="preserve">12. SOP-08 – Add a New Field to the Form</w:t>
       </w:r>
-      <w:bookmarkEnd w:id="34"/>
+      <w:bookmarkEnd w:id="35"/>
     </w:p>
     <w:p>
       <w:pPr>
@@ -16196,11 +16812,11 @@
         <w:pStyle w:val="Heading1"/>
         <w:pageBreakBefore/>
       </w:pPr>
-      <w:bookmarkStart w:name="_Toc35" w:id="35"/>
+      <w:bookmarkStart w:name="_Toc36" w:id="36"/>
       <w:r>
         <w:t xml:space="preserve">13. SOP-09 – Go Live: Azure DevOps, Sign-in and HTTPS</w:t>
       </w:r>
-      <w:bookmarkEnd w:id="35"/>
+      <w:bookmarkEnd w:id="36"/>
     </w:p>
     <w:p>
       <w:pPr>
@@ -16214,322 +16830,11 @@
       <w:pPr>
         <w:pStyle w:val="Heading2"/>
       </w:pPr>
-      <w:bookmarkStart w:name="_Toc36" w:id="36"/>
+      <w:bookmarkStart w:name="_Toc37" w:id="37"/>
       <w:r>
         <w:t xml:space="preserve">13.1 Part A – Azure DevOps pipeline</w:t>
       </w:r>
-      <w:bookmarkEnd w:id="36"/>
-    </w:p>
-    <w:p>
-      <w:pPr>
-        <w:pStyle w:val="ListParagraph"/>
-        <w:numPr>
-          <w:ilvl w:val="0"/>
-          <w:numId w:val="11"/>
-        </w:numPr>
-        <w:spacing w:after="80"/>
-      </w:pPr>
-      <w:r>
-        <w:t xml:space="preserve">Copy </w:t>
-      </w:r>
-      <w:r>
-        <w:rPr>
-          <w:rFonts w:ascii="Consolas" w:cs="Consolas" w:eastAsia="Consolas" w:hAnsi="Consolas"/>
-          <w:color w:val="8A2F2A"/>
-          <w:sz w:val="19"/>
-          <w:szCs w:val="19"/>
-        </w:rPr>
-        <w:t xml:space="preserve">pipelines/provision-vm.yml</w:t>
-      </w:r>
-      <w:r>
-        <w:t xml:space="preserve"> into the repository that holds the Terraform code. Adjust </w:t>
-      </w:r>
-      <w:r>
-        <w:rPr>
-          <w:rFonts w:ascii="Consolas" w:cs="Consolas" w:eastAsia="Consolas" w:hAnsi="Consolas"/>
-          <w:color w:val="8A2F2A"/>
-          <w:sz w:val="19"/>
-          <w:szCs w:val="19"/>
-        </w:rPr>
-        <w:t xml:space="preserve">tfDir</w:t>
-      </w:r>
-      <w:r>
-        <w:t xml:space="preserve">, the agent pool names, the variable group, the Terraform backend key and the </w:t>
-      </w:r>
-      <w:r>
-        <w:rPr>
-          <w:rFonts w:ascii="Consolas" w:cs="Consolas" w:eastAsia="Consolas" w:hAnsi="Consolas"/>
-          <w:color w:val="8A2F2A"/>
-          <w:sz w:val="19"/>
-          <w:szCs w:val="19"/>
-        </w:rPr>
-        <w:t xml:space="preserve">TF_VAR_*</w:t>
-      </w:r>
-      <w:r>
-        <w:t xml:space="preserve"> secrets.</w:t>
-      </w:r>
-    </w:p>
-    <w:p>
-      <w:pPr>
-        <w:pStyle w:val="ListParagraph"/>
-        <w:numPr>
-          <w:ilvl w:val="0"/>
-          <w:numId w:val="11"/>
-        </w:numPr>
-        <w:spacing w:after="80"/>
-      </w:pPr>
-      <w:r>
-        <w:t xml:space="preserve">In Azure DevOps: Pipelines → New pipeline → Existing YAML file → select the file → Save (do not run).</w:t>
-      </w:r>
-    </w:p>
-    <w:p>
-      <w:pPr>
-        <w:pStyle w:val="ListParagraph"/>
-        <w:numPr>
-          <w:ilvl w:val="0"/>
-          <w:numId w:val="11"/>
-        </w:numPr>
-        <w:spacing w:after="80"/>
-      </w:pPr>
-      <w:r>
-        <w:t xml:space="preserve">Note the pipeline ID: the </w:t>
-      </w:r>
-      <w:r>
-        <w:rPr>
-          <w:rFonts w:ascii="Consolas" w:cs="Consolas" w:eastAsia="Consolas" w:hAnsi="Consolas"/>
-          <w:color w:val="8A2F2A"/>
-          <w:sz w:val="19"/>
-          <w:szCs w:val="19"/>
-        </w:rPr>
-        <w:t xml:space="preserve">definitionId=</w:t>
-      </w:r>
-      <w:r>
-        <w:t xml:space="preserve"> number in the pipeline's URL.</w:t>
-      </w:r>
-    </w:p>
-    <w:p>
-      <w:pPr>
-        <w:pStyle w:val="ListParagraph"/>
-        <w:numPr>
-          <w:ilvl w:val="0"/>
-          <w:numId w:val="11"/>
-        </w:numPr>
-        <w:spacing w:after="80"/>
-      </w:pPr>
-      <w:r>
-        <w:t xml:space="preserve">Create the Environments </w:t>
-      </w:r>
-      <w:r>
-        <w:rPr>
-          <w:rFonts w:ascii="Consolas" w:cs="Consolas" w:eastAsia="Consolas" w:hAnsi="Consolas"/>
-          <w:color w:val="8A2F2A"/>
-          <w:sz w:val="19"/>
-          <w:szCs w:val="19"/>
-        </w:rPr>
-        <w:t xml:space="preserve">vm-provisioning-prod</w:t>
-      </w:r>
-      <w:r>
-        <w:t xml:space="preserve">, </w:t>
-      </w:r>
-      <w:r>
-        <w:rPr>
-          <w:rFonts w:ascii="Consolas" w:cs="Consolas" w:eastAsia="Consolas" w:hAnsi="Consolas"/>
-          <w:color w:val="8A2F2A"/>
-          <w:sz w:val="19"/>
-          <w:szCs w:val="19"/>
-        </w:rPr>
-        <w:t xml:space="preserve">vm-provisioning-preprod</w:t>
-      </w:r>
-      <w:r>
-        <w:t xml:space="preserve">, </w:t>
-      </w:r>
-      <w:r>
-        <w:rPr>
-          <w:rFonts w:ascii="Consolas" w:cs="Consolas" w:eastAsia="Consolas" w:hAnsi="Consolas"/>
-          <w:color w:val="8A2F2A"/>
-          <w:sz w:val="19"/>
-          <w:szCs w:val="19"/>
-        </w:rPr>
-        <w:t xml:space="preserve">vm-provisioning-test</w:t>
-      </w:r>
-      <w:r>
-        <w:t xml:space="preserve">, </w:t>
-      </w:r>
-      <w:r>
-        <w:rPr>
-          <w:rFonts w:ascii="Consolas" w:cs="Consolas" w:eastAsia="Consolas" w:hAnsi="Consolas"/>
-          <w:color w:val="8A2F2A"/>
-          <w:sz w:val="19"/>
-          <w:szCs w:val="19"/>
-        </w:rPr>
-        <w:t xml:space="preserve">vm-provisioning-dev</w:t>
-      </w:r>
-      <w:r>
-        <w:t xml:space="preserve">. On </w:t>
-      </w:r>
-      <w:r>
-        <w:rPr>
-          <w:rFonts w:ascii="Consolas" w:cs="Consolas" w:eastAsia="Consolas" w:hAnsi="Consolas"/>
-          <w:color w:val="8A2F2A"/>
-          <w:sz w:val="19"/>
-          <w:szCs w:val="19"/>
-        </w:rPr>
-        <w:t xml:space="preserve">vm-provisioning-prod</w:t>
-      </w:r>
-      <w:r>
-        <w:t xml:space="preserve"> add Approvals and checks → Approvals.</w:t>
-      </w:r>
-    </w:p>
-    <w:p>
-      <w:pPr>
-        <w:pStyle w:val="ListParagraph"/>
-        <w:numPr>
-          <w:ilvl w:val="0"/>
-          <w:numId w:val="11"/>
-        </w:numPr>
-        <w:spacing w:after="80"/>
-      </w:pPr>
-      <w:r>
-        <w:t xml:space="preserve">Run the pipeline once by hand for a Dev test VM and click </w:t>
-      </w:r>
-      <w:r>
-        <w:rPr>
-          <w:b/>
-          <w:bCs/>
-        </w:rPr>
-        <w:t xml:space="preserve">Permit</w:t>
-      </w:r>
-      <w:r>
-        <w:t xml:space="preserve"> for the variable group, environments and agent pool. Otherwise portal runs wait for this permission.</w:t>
-      </w:r>
-    </w:p>
-    <w:p>
-      <w:pPr>
-        <w:pStyle w:val="ListParagraph"/>
-        <w:numPr>
-          <w:ilvl w:val="0"/>
-          <w:numId w:val="11"/>
-        </w:numPr>
-        <w:spacing w:after="80"/>
-      </w:pPr>
-      <w:r>
-        <w:t xml:space="preserve">Create a PAT for a service account with scope </w:t>
-      </w:r>
-      <w:r>
-        <w:rPr>
-          <w:b/>
-          <w:bCs/>
-        </w:rPr>
-        <w:t xml:space="preserve">Build: Read &amp; execute</w:t>
-      </w:r>
-      <w:r>
-        <w:t xml:space="preserve"> (or use a service principal with Queue builds permission and set </w:t>
-      </w:r>
-      <w:r>
-        <w:rPr>
-          <w:rFonts w:ascii="Consolas" w:cs="Consolas" w:eastAsia="Consolas" w:hAnsi="Consolas"/>
-          <w:color w:val="8A2F2A"/>
-          <w:sz w:val="19"/>
-          <w:szCs w:val="19"/>
-        </w:rPr>
-        <w:t xml:space="preserve">portal_ado_auth: service_principal</w:t>
-      </w:r>
-      <w:r>
-        <w:t xml:space="preserve">).</w:t>
-      </w:r>
-    </w:p>
-    <w:p>
-      <w:pPr>
-        <w:pStyle w:val="Heading2"/>
-      </w:pPr>
-      <w:bookmarkStart w:name="_Toc37" w:id="37"/>
-      <w:r>
-        <w:t xml:space="preserve">13.2 Part B – Microsoft Entra ID sign-in</w:t>
-      </w:r>
       <w:bookmarkEnd w:id="37"/>
-    </w:p>
-    <w:p>
-      <w:pPr>
-        <w:pStyle w:val="ListParagraph"/>
-        <w:numPr>
-          <w:ilvl w:val="0"/>
-          <w:numId w:val="12"/>
-        </w:numPr>
-        <w:spacing w:after="80"/>
-      </w:pPr>
-      <w:r>
-        <w:t xml:space="preserve">Entra ID → App registrations → New registration (single tenant). Redirect URI type </w:t>
-      </w:r>
-      <w:r>
-        <w:rPr>
-          <w:b/>
-          <w:bCs/>
-        </w:rPr>
-        <w:t xml:space="preserve">Web</w:t>
-      </w:r>
-      <w:r>
-        <w:t xml:space="preserve">: </w:t>
-      </w:r>
-      <w:r>
-        <w:rPr>
-          <w:rFonts w:ascii="Consolas" w:cs="Consolas" w:eastAsia="Consolas" w:hAnsi="Consolas"/>
-          <w:color w:val="8A2F2A"/>
-          <w:sz w:val="19"/>
-          <w:szCs w:val="19"/>
-        </w:rPr>
-        <w:t xml:space="preserve">https://&lt;portal-dns-name&gt;/auth/callback</w:t>
-      </w:r>
-      <w:r>
-        <w:t xml:space="preserve">.</w:t>
-      </w:r>
-    </w:p>
-    <w:p>
-      <w:pPr>
-        <w:pStyle w:val="ListParagraph"/>
-        <w:numPr>
-          <w:ilvl w:val="0"/>
-          <w:numId w:val="12"/>
-        </w:numPr>
-        <w:spacing w:after="80"/>
-      </w:pPr>
-      <w:r>
-        <w:t xml:space="preserve">Certificates &amp; secrets → New client secret. Copy the value now.</w:t>
-      </w:r>
-    </w:p>
-    <w:p>
-      <w:pPr>
-        <w:pStyle w:val="ListParagraph"/>
-        <w:numPr>
-          <w:ilvl w:val="0"/>
-          <w:numId w:val="12"/>
-        </w:numPr>
-        <w:spacing w:after="80"/>
-      </w:pPr>
-      <w:r>
-        <w:t xml:space="preserve">App roles → create </w:t>
-      </w:r>
-      <w:r>
-        <w:rPr>
-          <w:rFonts w:ascii="Consolas" w:cs="Consolas" w:eastAsia="Consolas" w:hAnsi="Consolas"/>
-          <w:color w:val="8A2F2A"/>
-          <w:sz w:val="19"/>
-          <w:szCs w:val="19"/>
-        </w:rPr>
-        <w:t xml:space="preserve">Provisioning.Requester</w:t>
-      </w:r>
-      <w:r>
-        <w:t xml:space="preserve"> and assign the users or groups who may submit requests (Enterprise applications → Users and groups).</w:t>
-      </w:r>
-    </w:p>
-    <w:p>
-      <w:pPr>
-        <w:pStyle w:val="Heading2"/>
-      </w:pPr>
-      <w:bookmarkStart w:name="_Toc38" w:id="38"/>
-      <w:r>
-        <w:t xml:space="preserve">13.3 Part C – HTTPS and DNS</w:t>
-      </w:r>
-      <w:bookmarkEnd w:id="38"/>
     </w:p>
     <w:p>
       <w:pPr>
@@ -16541,7 +16846,7 @@
         <w:spacing w:after="80"/>
       </w:pPr>
       <w:r>
-        <w:t xml:space="preserve">Create a DNS record for the portal name (for example </w:t>
+        <w:t xml:space="preserve">Copy </w:t>
       </w:r>
       <w:r>
         <w:rPr>
@@ -16550,20 +16855,34 @@
           <w:sz w:val="19"/>
           <w:szCs w:val="19"/>
         </w:rPr>
-        <w:t xml:space="preserve">provisioning.unitedlex.global</w:t>
-      </w:r>
-      <w:r>
-        <w:t xml:space="preserve">) pointing to </w:t>
-      </w:r>
-      <w:r>
-        <w:rPr>
-          <w:b/>
-          <w:bCs/>
-        </w:rPr>
-        <w:t xml:space="preserve">10.192.2.153</w:t>
-      </w:r>
-      <w:r>
-        <w:t xml:space="preserve">.</w:t>
+        <w:t xml:space="preserve">pipelines/provision-vm.yml</w:t>
+      </w:r>
+      <w:r>
+        <w:t xml:space="preserve"> into the repository that holds the Terraform code. Adjust </w:t>
+      </w:r>
+      <w:r>
+        <w:rPr>
+          <w:rFonts w:ascii="Consolas" w:cs="Consolas" w:eastAsia="Consolas" w:hAnsi="Consolas"/>
+          <w:color w:val="8A2F2A"/>
+          <w:sz w:val="19"/>
+          <w:szCs w:val="19"/>
+        </w:rPr>
+        <w:t xml:space="preserve">tfDir</w:t>
+      </w:r>
+      <w:r>
+        <w:t xml:space="preserve">, the agent pool names, the variable group, the Terraform backend key and the </w:t>
+      </w:r>
+      <w:r>
+        <w:rPr>
+          <w:rFonts w:ascii="Consolas" w:cs="Consolas" w:eastAsia="Consolas" w:hAnsi="Consolas"/>
+          <w:color w:val="8A2F2A"/>
+          <w:sz w:val="19"/>
+          <w:szCs w:val="19"/>
+        </w:rPr>
+        <w:t xml:space="preserve">TF_VAR_*</w:t>
+      </w:r>
+      <w:r>
+        <w:t xml:space="preserve"> secrets.</w:t>
       </w:r>
     </w:p>
     <w:p>
@@ -16576,7 +16895,20 @@
         <w:spacing w:after="80"/>
       </w:pPr>
       <w:r>
-        <w:t xml:space="preserve">Get a certificate for that name from your CA. Save the certificate and key on the controller as </w:t>
+        <w:t xml:space="preserve">In Azure DevOps: Pipelines → New pipeline → Existing YAML file → select the file → Save (do not run).</w:t>
+      </w:r>
+    </w:p>
+    <w:p>
+      <w:pPr>
+        <w:pStyle w:val="ListParagraph"/>
+        <w:numPr>
+          <w:ilvl w:val="0"/>
+          <w:numId w:val="13"/>
+        </w:numPr>
+        <w:spacing w:after="80"/>
+      </w:pPr>
+      <w:r>
+        <w:t xml:space="preserve">Note the pipeline ID: the </w:t>
       </w:r>
       <w:r>
         <w:rPr>
@@ -16585,10 +16917,23 @@
           <w:sz w:val="19"/>
           <w:szCs w:val="19"/>
         </w:rPr>
-        <w:t xml:space="preserve">ansible/files/portal.crt</w:t>
-      </w:r>
-      <w:r>
-        <w:t xml:space="preserve"> and </w:t>
+        <w:t xml:space="preserve">definitionId=</w:t>
+      </w:r>
+      <w:r>
+        <w:t xml:space="preserve"> number in the pipeline's URL.</w:t>
+      </w:r>
+    </w:p>
+    <w:p>
+      <w:pPr>
+        <w:pStyle w:val="ListParagraph"/>
+        <w:numPr>
+          <w:ilvl w:val="0"/>
+          <w:numId w:val="13"/>
+        </w:numPr>
+        <w:spacing w:after="80"/>
+      </w:pPr>
+      <w:r>
+        <w:t xml:space="preserve">Create the Environments </w:t>
       </w:r>
       <w:r>
         <w:rPr>
@@ -16597,21 +16942,127 @@
           <w:sz w:val="19"/>
           <w:szCs w:val="19"/>
         </w:rPr>
-        <w:t xml:space="preserve">ansible/files/portal.key</w:t>
-      </w:r>
-      <w:r>
-        <w:t xml:space="preserve"> (do not commit the key).</w:t>
+        <w:t xml:space="preserve">vm-provisioning-prod</w:t>
+      </w:r>
+      <w:r>
+        <w:t xml:space="preserve">, </w:t>
+      </w:r>
+      <w:r>
+        <w:rPr>
+          <w:rFonts w:ascii="Consolas" w:cs="Consolas" w:eastAsia="Consolas" w:hAnsi="Consolas"/>
+          <w:color w:val="8A2F2A"/>
+          <w:sz w:val="19"/>
+          <w:szCs w:val="19"/>
+        </w:rPr>
+        <w:t xml:space="preserve">vm-provisioning-preprod</w:t>
+      </w:r>
+      <w:r>
+        <w:t xml:space="preserve">, </w:t>
+      </w:r>
+      <w:r>
+        <w:rPr>
+          <w:rFonts w:ascii="Consolas" w:cs="Consolas" w:eastAsia="Consolas" w:hAnsi="Consolas"/>
+          <w:color w:val="8A2F2A"/>
+          <w:sz w:val="19"/>
+          <w:szCs w:val="19"/>
+        </w:rPr>
+        <w:t xml:space="preserve">vm-provisioning-test</w:t>
+      </w:r>
+      <w:r>
+        <w:t xml:space="preserve">, </w:t>
+      </w:r>
+      <w:r>
+        <w:rPr>
+          <w:rFonts w:ascii="Consolas" w:cs="Consolas" w:eastAsia="Consolas" w:hAnsi="Consolas"/>
+          <w:color w:val="8A2F2A"/>
+          <w:sz w:val="19"/>
+          <w:szCs w:val="19"/>
+        </w:rPr>
+        <w:t xml:space="preserve">vm-provisioning-dev</w:t>
+      </w:r>
+      <w:r>
+        <w:t xml:space="preserve">. On </w:t>
+      </w:r>
+      <w:r>
+        <w:rPr>
+          <w:rFonts w:ascii="Consolas" w:cs="Consolas" w:eastAsia="Consolas" w:hAnsi="Consolas"/>
+          <w:color w:val="8A2F2A"/>
+          <w:sz w:val="19"/>
+          <w:szCs w:val="19"/>
+        </w:rPr>
+        <w:t xml:space="preserve">vm-provisioning-prod</w:t>
+      </w:r>
+      <w:r>
+        <w:t xml:space="preserve"> add Approvals and checks → Approvals.</w:t>
+      </w:r>
+    </w:p>
+    <w:p>
+      <w:pPr>
+        <w:pStyle w:val="ListParagraph"/>
+        <w:numPr>
+          <w:ilvl w:val="0"/>
+          <w:numId w:val="13"/>
+        </w:numPr>
+        <w:spacing w:after="80"/>
+      </w:pPr>
+      <w:r>
+        <w:t xml:space="preserve">Run the pipeline once by hand for a Dev test VM and click </w:t>
+      </w:r>
+      <w:r>
+        <w:rPr>
+          <w:b/>
+          <w:bCs/>
+        </w:rPr>
+        <w:t xml:space="preserve">Permit</w:t>
+      </w:r>
+      <w:r>
+        <w:t xml:space="preserve"> for the variable group, environments and agent pool. Otherwise portal runs wait for this permission.</w:t>
+      </w:r>
+    </w:p>
+    <w:p>
+      <w:pPr>
+        <w:pStyle w:val="ListParagraph"/>
+        <w:numPr>
+          <w:ilvl w:val="0"/>
+          <w:numId w:val="13"/>
+        </w:numPr>
+        <w:spacing w:after="80"/>
+      </w:pPr>
+      <w:r>
+        <w:t xml:space="preserve">Create a PAT for a service account with scope </w:t>
+      </w:r>
+      <w:r>
+        <w:rPr>
+          <w:b/>
+          <w:bCs/>
+        </w:rPr>
+        <w:t xml:space="preserve">Build: Read &amp; execute</w:t>
+      </w:r>
+      <w:r>
+        <w:t xml:space="preserve"> (or use a service principal with Queue builds permission and set </w:t>
+      </w:r>
+      <w:r>
+        <w:rPr>
+          <w:rFonts w:ascii="Consolas" w:cs="Consolas" w:eastAsia="Consolas" w:hAnsi="Consolas"/>
+          <w:color w:val="8A2F2A"/>
+          <w:sz w:val="19"/>
+          <w:szCs w:val="19"/>
+        </w:rPr>
+        <w:t xml:space="preserve">portal_ado_auth: service_principal</w:t>
+      </w:r>
+      <w:r>
+        <w:t xml:space="preserve">).</w:t>
       </w:r>
     </w:p>
     <w:p>
       <w:pPr>
         <w:pStyle w:val="Heading2"/>
       </w:pPr>
-      <w:bookmarkStart w:name="_Toc39" w:id="39"/>
-      <w:r>
-        <w:t xml:space="preserve">13.4 Part D – Settings and deployment</w:t>
-      </w:r>
-      <w:bookmarkEnd w:id="39"/>
+      <w:bookmarkStart w:name="_Toc38" w:id="38"/>
+      <w:r>
+        <w:t xml:space="preserve">13.2 Part B – Microsoft Entra ID sign-in</w:t>
+      </w:r>
+      <w:bookmarkEnd w:id="38"/>
     </w:p>
     <w:p>
       <w:pPr>
@@ -16623,6 +17074,171 @@
         <w:spacing w:after="80"/>
       </w:pPr>
       <w:r>
+        <w:t xml:space="preserve">Entra ID → App registrations → New registration (single tenant). Redirect URI type </w:t>
+      </w:r>
+      <w:r>
+        <w:rPr>
+          <w:b/>
+          <w:bCs/>
+        </w:rPr>
+        <w:t xml:space="preserve">Web</w:t>
+      </w:r>
+      <w:r>
+        <w:t xml:space="preserve">: </w:t>
+      </w:r>
+      <w:r>
+        <w:rPr>
+          <w:rFonts w:ascii="Consolas" w:cs="Consolas" w:eastAsia="Consolas" w:hAnsi="Consolas"/>
+          <w:color w:val="8A2F2A"/>
+          <w:sz w:val="19"/>
+          <w:szCs w:val="19"/>
+        </w:rPr>
+        <w:t xml:space="preserve">https://&lt;portal-dns-name&gt;/auth/callback</w:t>
+      </w:r>
+      <w:r>
+        <w:t xml:space="preserve">.</w:t>
+      </w:r>
+    </w:p>
+    <w:p>
+      <w:pPr>
+        <w:pStyle w:val="ListParagraph"/>
+        <w:numPr>
+          <w:ilvl w:val="0"/>
+          <w:numId w:val="14"/>
+        </w:numPr>
+        <w:spacing w:after="80"/>
+      </w:pPr>
+      <w:r>
+        <w:t xml:space="preserve">Certificates &amp; secrets → New client secret. Copy the value now.</w:t>
+      </w:r>
+    </w:p>
+    <w:p>
+      <w:pPr>
+        <w:pStyle w:val="ListParagraph"/>
+        <w:numPr>
+          <w:ilvl w:val="0"/>
+          <w:numId w:val="14"/>
+        </w:numPr>
+        <w:spacing w:after="80"/>
+      </w:pPr>
+      <w:r>
+        <w:t xml:space="preserve">App roles → create </w:t>
+      </w:r>
+      <w:r>
+        <w:rPr>
+          <w:rFonts w:ascii="Consolas" w:cs="Consolas" w:eastAsia="Consolas" w:hAnsi="Consolas"/>
+          <w:color w:val="8A2F2A"/>
+          <w:sz w:val="19"/>
+          <w:szCs w:val="19"/>
+        </w:rPr>
+        <w:t xml:space="preserve">Provisioning.Requester</w:t>
+      </w:r>
+      <w:r>
+        <w:t xml:space="preserve"> and assign the users or groups who may submit requests (Enterprise applications → Users and groups).</w:t>
+      </w:r>
+    </w:p>
+    <w:p>
+      <w:pPr>
+        <w:pStyle w:val="Heading2"/>
+      </w:pPr>
+      <w:bookmarkStart w:name="_Toc39" w:id="39"/>
+      <w:r>
+        <w:t xml:space="preserve">13.3 Part C – HTTPS and DNS</w:t>
+      </w:r>
+      <w:bookmarkEnd w:id="39"/>
+    </w:p>
+    <w:p>
+      <w:pPr>
+        <w:pStyle w:val="ListParagraph"/>
+        <w:numPr>
+          <w:ilvl w:val="0"/>
+          <w:numId w:val="15"/>
+        </w:numPr>
+        <w:spacing w:after="80"/>
+      </w:pPr>
+      <w:r>
+        <w:t xml:space="preserve">Create a DNS record for the portal name (for example </w:t>
+      </w:r>
+      <w:r>
+        <w:rPr>
+          <w:rFonts w:ascii="Consolas" w:cs="Consolas" w:eastAsia="Consolas" w:hAnsi="Consolas"/>
+          <w:color w:val="8A2F2A"/>
+          <w:sz w:val="19"/>
+          <w:szCs w:val="19"/>
+        </w:rPr>
+        <w:t xml:space="preserve">provisioning.unitedlex.global</w:t>
+      </w:r>
+      <w:r>
+        <w:t xml:space="preserve">) pointing to </w:t>
+      </w:r>
+      <w:r>
+        <w:rPr>
+          <w:b/>
+          <w:bCs/>
+        </w:rPr>
+        <w:t xml:space="preserve">10.192.2.153</w:t>
+      </w:r>
+      <w:r>
+        <w:t xml:space="preserve">.</w:t>
+      </w:r>
+    </w:p>
+    <w:p>
+      <w:pPr>
+        <w:pStyle w:val="ListParagraph"/>
+        <w:numPr>
+          <w:ilvl w:val="0"/>
+          <w:numId w:val="15"/>
+        </w:numPr>
+        <w:spacing w:after="80"/>
+      </w:pPr>
+      <w:r>
+        <w:t xml:space="preserve">Get a certificate for that name from your CA. Save the certificate and key on the controller as </w:t>
+      </w:r>
+      <w:r>
+        <w:rPr>
+          <w:rFonts w:ascii="Consolas" w:cs="Consolas" w:eastAsia="Consolas" w:hAnsi="Consolas"/>
+          <w:color w:val="8A2F2A"/>
+          <w:sz w:val="19"/>
+          <w:szCs w:val="19"/>
+        </w:rPr>
+        <w:t xml:space="preserve">ansible/files/portal.crt</w:t>
+      </w:r>
+      <w:r>
+        <w:t xml:space="preserve"> and </w:t>
+      </w:r>
+      <w:r>
+        <w:rPr>
+          <w:rFonts w:ascii="Consolas" w:cs="Consolas" w:eastAsia="Consolas" w:hAnsi="Consolas"/>
+          <w:color w:val="8A2F2A"/>
+          <w:sz w:val="19"/>
+          <w:szCs w:val="19"/>
+        </w:rPr>
+        <w:t xml:space="preserve">ansible/files/portal.key</w:t>
+      </w:r>
+      <w:r>
+        <w:t xml:space="preserve"> (do not commit the key).</w:t>
+      </w:r>
+    </w:p>
+    <w:p>
+      <w:pPr>
+        <w:pStyle w:val="Heading2"/>
+      </w:pPr>
+      <w:bookmarkStart w:name="_Toc40" w:id="40"/>
+      <w:r>
+        <w:t xml:space="preserve">13.4 Part D – Settings and deployment</w:t>
+      </w:r>
+      <w:bookmarkEnd w:id="40"/>
+    </w:p>
+    <w:p>
+      <w:pPr>
+        <w:pStyle w:val="ListParagraph"/>
+        <w:numPr>
+          <w:ilvl w:val="0"/>
+          <w:numId w:val="16"/>
+        </w:numPr>
+        <w:spacing w:after="80"/>
+      </w:pPr>
+      <w:r>
         <w:t xml:space="preserve">Encrypt each secret with Ansible Vault and paste the output into </w:t>
       </w:r>
       <w:r>
@@ -16700,7 +17316,7 @@
         <w:pStyle w:val="ListParagraph"/>
         <w:numPr>
           <w:ilvl w:val="0"/>
-          <w:numId w:val="14"/>
+          <w:numId w:val="16"/>
         </w:numPr>
         <w:spacing w:after="80"/>
       </w:pPr>
@@ -17048,7 +17664,7 @@
         <w:pStyle w:val="ListParagraph"/>
         <w:numPr>
           <w:ilvl w:val="0"/>
-          <w:numId w:val="14"/>
+          <w:numId w:val="16"/>
         </w:numPr>
         <w:spacing w:after="80"/>
       </w:pPr>
@@ -17080,7 +17696,7 @@
         <w:pStyle w:val="ListParagraph"/>
         <w:numPr>
           <w:ilvl w:val="0"/>
-          <w:numId w:val="14"/>
+          <w:numId w:val="16"/>
         </w:numPr>
         <w:spacing w:after="80"/>
       </w:pPr>
@@ -17127,7 +17743,7 @@
         <w:pStyle w:val="ListParagraph"/>
         <w:numPr>
           <w:ilvl w:val="0"/>
-          <w:numId w:val="14"/>
+          <w:numId w:val="16"/>
         </w:numPr>
         <w:spacing w:after="80"/>
       </w:pPr>
@@ -17150,11 +17766,11 @@
         <w:pStyle w:val="Heading1"/>
         <w:pageBreakBefore/>
       </w:pPr>
-      <w:bookmarkStart w:name="_Toc40" w:id="40"/>
+      <w:bookmarkStart w:name="_Toc41" w:id="41"/>
       <w:r>
         <w:t xml:space="preserve">14. Rollback Procedure</w:t>
       </w:r>
-      <w:bookmarkEnd w:id="40"/>
+      <w:bookmarkEnd w:id="41"/>
     </w:p>
     <w:p>
       <w:pPr>
@@ -17168,11 +17784,11 @@
       <w:pPr>
         <w:pStyle w:val="Heading2"/>
       </w:pPr>
-      <w:bookmarkStart w:name="_Toc41" w:id="41"/>
+      <w:bookmarkStart w:name="_Toc42" w:id="42"/>
       <w:r>
         <w:t xml:space="preserve">14.1 Standard rollback (preferred)</w:t>
       </w:r>
-      <w:bookmarkEnd w:id="41"/>
+      <w:bookmarkEnd w:id="42"/>
     </w:p>
     <w:p>
       <w:pPr>
@@ -17273,11 +17889,11 @@
       <w:pPr>
         <w:pStyle w:val="Heading2"/>
       </w:pPr>
-      <w:bookmarkStart w:name="_Toc42" w:id="42"/>
+      <w:bookmarkStart w:name="_Toc43" w:id="43"/>
       <w:r>
         <w:t xml:space="preserve">14.2 Emergency rollback (no time to revert)</w:t>
       </w:r>
-      <w:bookmarkEnd w:id="42"/>
+      <w:bookmarkEnd w:id="43"/>
     </w:p>
     <w:p>
       <w:pPr>
@@ -17359,11 +17975,11 @@
       <w:pPr>
         <w:pStyle w:val="Heading2"/>
       </w:pPr>
-      <w:bookmarkStart w:name="_Toc43" w:id="43"/>
+      <w:bookmarkStart w:name="_Toc44" w:id="44"/>
       <w:r>
         <w:t xml:space="preserve">14.3 Take one node out of service</w:t>
       </w:r>
-      <w:bookmarkEnd w:id="43"/>
+      <w:bookmarkEnd w:id="44"/>
     </w:p>
     <w:p>
       <w:pPr>
@@ -17435,28 +18051,28 @@
         <w:pStyle w:val="Heading1"/>
         <w:pageBreakBefore/>
       </w:pPr>
-      <w:bookmarkStart w:name="_Toc44" w:id="44"/>
+      <w:bookmarkStart w:name="_Toc45" w:id="45"/>
       <w:r>
         <w:t xml:space="preserve">15. SOP-10 – Change the VIP or a Node IP, or Replace a Node</w:t>
       </w:r>
-      <w:bookmarkEnd w:id="44"/>
+      <w:bookmarkEnd w:id="45"/>
     </w:p>
     <w:p>
       <w:pPr>
         <w:pStyle w:val="Heading2"/>
       </w:pPr>
-      <w:bookmarkStart w:name="_Toc45" w:id="45"/>
+      <w:bookmarkStart w:name="_Toc46" w:id="46"/>
       <w:r>
         <w:t xml:space="preserve">15.1 Change the VIP</w:t>
       </w:r>
-      <w:bookmarkEnd w:id="45"/>
+      <w:bookmarkEnd w:id="46"/>
     </w:p>
     <w:p>
       <w:pPr>
         <w:pStyle w:val="ListParagraph"/>
         <w:numPr>
           <w:ilvl w:val="0"/>
-          <w:numId w:val="15"/>
+          <w:numId w:val="17"/>
         </w:numPr>
         <w:spacing w:after="80"/>
       </w:pPr>
@@ -17469,7 +18085,7 @@
         <w:pStyle w:val="ListParagraph"/>
         <w:numPr>
           <w:ilvl w:val="0"/>
-          <w:numId w:val="15"/>
+          <w:numId w:val="17"/>
         </w:numPr>
         <w:spacing w:after="80"/>
       </w:pPr>
@@ -17518,7 +18134,7 @@
         <w:pStyle w:val="ListParagraph"/>
         <w:numPr>
           <w:ilvl w:val="0"/>
-          <w:numId w:val="15"/>
+          <w:numId w:val="17"/>
         </w:numPr>
         <w:spacing w:after="80"/>
       </w:pPr>
@@ -17531,7 +18147,7 @@
         <w:pStyle w:val="ListParagraph"/>
         <w:numPr>
           <w:ilvl w:val="0"/>
-          <w:numId w:val="15"/>
+          <w:numId w:val="17"/>
         </w:numPr>
         <w:spacing w:after="80"/>
       </w:pPr>
@@ -17568,7 +18184,7 @@
         <w:pStyle w:val="ListParagraph"/>
         <w:numPr>
           <w:ilvl w:val="0"/>
-          <w:numId w:val="15"/>
+          <w:numId w:val="17"/>
         </w:numPr>
         <w:spacing w:after="80"/>
       </w:pPr>
@@ -17580,11 +18196,11 @@
       <w:pPr>
         <w:pStyle w:val="Heading2"/>
       </w:pPr>
-      <w:bookmarkStart w:name="_Toc46" w:id="46"/>
+      <w:bookmarkStart w:name="_Toc47" w:id="47"/>
       <w:r>
         <w:t xml:space="preserve">15.2 Change a node IP</w:t>
       </w:r>
-      <w:bookmarkEnd w:id="46"/>
+      <w:bookmarkEnd w:id="47"/>
     </w:p>
     <w:p>
       <w:pPr>
@@ -17622,18 +18238,18 @@
       <w:pPr>
         <w:pStyle w:val="Heading2"/>
       </w:pPr>
-      <w:bookmarkStart w:name="_Toc47" w:id="47"/>
+      <w:bookmarkStart w:name="_Toc48" w:id="48"/>
       <w:r>
         <w:t xml:space="preserve">15.3 Replace or rebuild a node</w:t>
       </w:r>
-      <w:bookmarkEnd w:id="47"/>
+      <w:bookmarkEnd w:id="48"/>
     </w:p>
     <w:p>
       <w:pPr>
         <w:pStyle w:val="ListParagraph"/>
         <w:numPr>
           <w:ilvl w:val="0"/>
-          <w:numId w:val="16"/>
+          <w:numId w:val="18"/>
         </w:numPr>
         <w:spacing w:after="80"/>
       </w:pPr>
@@ -17646,7 +18262,7 @@
         <w:pStyle w:val="ListParagraph"/>
         <w:numPr>
           <w:ilvl w:val="0"/>
-          <w:numId w:val="16"/>
+          <w:numId w:val="18"/>
         </w:numPr>
         <w:spacing w:after="80"/>
       </w:pPr>
@@ -17659,7 +18275,7 @@
         <w:pStyle w:val="ListParagraph"/>
         <w:numPr>
           <w:ilvl w:val="0"/>
-          <w:numId w:val="16"/>
+          <w:numId w:val="18"/>
         </w:numPr>
         <w:spacing w:after="80"/>
       </w:pPr>
@@ -17684,7 +18300,7 @@
         <w:pStyle w:val="ListParagraph"/>
         <w:numPr>
           <w:ilvl w:val="0"/>
-          <w:numId w:val="16"/>
+          <w:numId w:val="18"/>
         </w:numPr>
         <w:spacing w:after="80"/>
       </w:pPr>
@@ -17697,11 +18313,11 @@
         <w:pStyle w:val="Heading1"/>
         <w:pageBreakBefore/>
       </w:pPr>
-      <w:bookmarkStart w:name="_Toc48" w:id="48"/>
+      <w:bookmarkStart w:name="_Toc49" w:id="49"/>
       <w:r>
         <w:t xml:space="preserve">16. SOP-11 – Rotate Secrets and Credentials</w:t>
       </w:r>
-      <w:bookmarkEnd w:id="48"/>
+      <w:bookmarkEnd w:id="49"/>
     </w:p>
     <w:tbl>
       <w:tblPr>
@@ -18556,28 +19172,28 @@
         <w:pStyle w:val="Heading1"/>
         <w:pageBreakBefore/>
       </w:pPr>
-      <w:bookmarkStart w:name="_Toc49" w:id="49"/>
+      <w:bookmarkStart w:name="_Toc50" w:id="50"/>
       <w:r>
         <w:t xml:space="preserve">17. Troubleshooting Guide</w:t>
       </w:r>
-      <w:bookmarkEnd w:id="49"/>
+      <w:bookmarkEnd w:id="50"/>
     </w:p>
     <w:p>
       <w:pPr>
         <w:pStyle w:val="Heading2"/>
       </w:pPr>
-      <w:bookmarkStart w:name="_Toc50" w:id="50"/>
+      <w:bookmarkStart w:name="_Toc51" w:id="51"/>
       <w:r>
         <w:t xml:space="preserve">17.1 First steps for any problem</w:t>
       </w:r>
-      <w:bookmarkEnd w:id="50"/>
+      <w:bookmarkEnd w:id="51"/>
     </w:p>
     <w:p>
       <w:pPr>
         <w:pStyle w:val="ListParagraph"/>
         <w:numPr>
           <w:ilvl w:val="0"/>
-          <w:numId w:val="17"/>
+          <w:numId w:val="19"/>
         </w:numPr>
         <w:spacing w:after="80"/>
       </w:pPr>
@@ -18590,7 +19206,7 @@
         <w:pStyle w:val="ListParagraph"/>
         <w:numPr>
           <w:ilvl w:val="0"/>
-          <w:numId w:val="17"/>
+          <w:numId w:val="19"/>
         </w:numPr>
         <w:spacing w:after="80"/>
       </w:pPr>
@@ -18660,7 +19276,7 @@
         <w:pStyle w:val="ListParagraph"/>
         <w:numPr>
           <w:ilvl w:val="0"/>
-          <w:numId w:val="17"/>
+          <w:numId w:val="19"/>
         </w:numPr>
         <w:spacing w:after="80"/>
       </w:pPr>
@@ -18672,11 +19288,11 @@
       <w:pPr>
         <w:pStyle w:val="Heading2"/>
       </w:pPr>
-      <w:bookmarkStart w:name="_Toc51" w:id="51"/>
+      <w:bookmarkStart w:name="_Toc52" w:id="52"/>
       <w:r>
         <w:t xml:space="preserve">17.2 Symptom → cause → fix</w:t>
       </w:r>
-      <w:bookmarkEnd w:id="51"/>
+      <w:bookmarkEnd w:id="52"/>
     </w:p>
     <w:tbl>
       <w:tblPr>
@@ -20459,11 +21075,11 @@
       <w:pPr>
         <w:pStyle w:val="Heading2"/>
       </w:pPr>
-      <w:bookmarkStart w:name="_Toc52" w:id="52"/>
+      <w:bookmarkStart w:name="_Toc53" w:id="53"/>
       <w:r>
         <w:t xml:space="preserve">17.3 Useful diagnostic commands</w:t>
       </w:r>
-      <w:bookmarkEnd w:id="52"/>
+      <w:bookmarkEnd w:id="53"/>
     </w:p>
     <w:p>
       <w:pPr>
@@ -20698,11 +21314,11 @@
         <w:pStyle w:val="Heading1"/>
         <w:pageBreakBefore/>
       </w:pPr>
-      <w:bookmarkStart w:name="_Toc53" w:id="53"/>
+      <w:bookmarkStart w:name="_Toc54" w:id="54"/>
       <w:r>
         <w:t xml:space="preserve">18. Command Cheat Sheet</w:t>
       </w:r>
-      <w:bookmarkEnd w:id="53"/>
+      <w:bookmarkEnd w:id="54"/>
     </w:p>
     <w:p>
       <w:pPr>
@@ -21607,11 +22223,11 @@
         <w:pStyle w:val="Heading1"/>
         <w:pageBreakBefore/>
       </w:pPr>
-      <w:bookmarkStart w:name="_Toc54" w:id="54"/>
+      <w:bookmarkStart w:name="_Toc55" w:id="55"/>
       <w:r>
         <w:t xml:space="preserve">Appendix A – Configuration Variables (group_vars/frontend.yml)</w:t>
       </w:r>
-      <w:bookmarkEnd w:id="54"/>
+      <w:bookmarkEnd w:id="55"/>
     </w:p>
     <w:tbl>
       <w:tblPr>
@@ -23478,21 +24094,21 @@
         <w:pStyle w:val="Heading1"/>
         <w:pageBreakBefore/>
       </w:pPr>
-      <w:bookmarkStart w:name="_Toc55" w:id="55"/>
+      <w:bookmarkStart w:name="_Toc56" w:id="56"/>
       <w:r>
         <w:t xml:space="preserve">Appendix B – Pipeline Parameters and Request Data</w:t>
       </w:r>
-      <w:bookmarkEnd w:id="55"/>
+      <w:bookmarkEnd w:id="56"/>
     </w:p>
     <w:p>
       <w:pPr>
         <w:pStyle w:val="Heading2"/>
       </w:pPr>
-      <w:bookmarkStart w:name="_Toc56" w:id="56"/>
+      <w:bookmarkStart w:name="_Toc57" w:id="57"/>
       <w:r>
         <w:t xml:space="preserve">B.1 Parameters sent by the portal</w:t>
       </w:r>
-      <w:bookmarkEnd w:id="56"/>
+      <w:bookmarkEnd w:id="57"/>
     </w:p>
     <w:tbl>
       <w:tblPr>
@@ -24224,11 +24840,11 @@
       <w:pPr>
         <w:pStyle w:val="Heading2"/>
       </w:pPr>
-      <w:bookmarkStart w:name="_Toc57" w:id="57"/>
+      <w:bookmarkStart w:name="_Toc58" w:id="58"/>
       <w:r>
         <w:t xml:space="preserve">B.2 Keys inside requestJson</w:t>
       </w:r>
-      <w:bookmarkEnd w:id="57"/>
+      <w:bookmarkEnd w:id="58"/>
     </w:p>
     <w:tbl>
       <w:tblPr>
@@ -24707,11 +25323,11 @@
         <w:pStyle w:val="Heading1"/>
         <w:pageBreakBefore/>
       </w:pPr>
-      <w:bookmarkStart w:name="_Toc58" w:id="58"/>
+      <w:bookmarkStart w:name="_Toc59" w:id="59"/>
       <w:r>
         <w:t xml:space="preserve">Appendix C – Screenshots</w:t>
       </w:r>
-      <w:bookmarkEnd w:id="58"/>
+      <w:bookmarkEnd w:id="59"/>
     </w:p>
     <w:p>
       <w:pPr>
@@ -25031,7 +25647,7 @@
         <w:sz w:val="16"/>
         <w:szCs w:val="16"/>
       </w:rPr>
-      <w:t xml:space="preserve">Internal – v1.0</w:t>
+      <w:t xml:space="preserve">Internal – v1.1</w:t>
     </w:r>
     <w:r>
       <w:rPr>
@@ -25345,6 +25961,18 @@
     </w:lvlOverride>
   </w:num>
   <w:num w:numId="17">
+    <w:abstractNumId w:val="3"/>
+    <w:lvlOverride w:ilvl="0">
+      <w:startOverride w:val="1"/>
+    </w:lvlOverride>
+  </w:num>
+  <w:num w:numId="18">
+    <w:abstractNumId w:val="3"/>
+    <w:lvlOverride w:ilvl="0">
+      <w:startOverride w:val="1"/>
+    </w:lvlOverride>
+  </w:num>
+  <w:num w:numId="19">
     <w:abstractNumId w:val="3"/>
     <w:lvlOverride w:ilvl="0">
       <w:startOverride w:val="1"/>

</xml_diff>